<commit_message>
operations: add free tier caveat + per-feature usage estimates
§0.3 (new): Free tier warning — under the free tier, requests are
used to improve Google's models, so for medical data (PII/PHI under
3省2ガイドライン) the paid tier (= billing-linked project) is
mandatory. Free tier acceptable only for dev/PoC with dummy data.

§6.2 unit price table with text/image vs audio rates for Gemini 2.5
Flash and Live API (3.1 Flash Live Preview).

§6.3 per-call cost breakdown:
- AI スキャン: ~1 円/page → ~8 円/user (4 test types × 2 pages)
- AI 問診: ~14 円/session (4 min in + 4 min out audio)
- AI ヘルスコーチ: ~1.5 円/question (full Elith JSON context)

§6.4 user-scale scenarios: pilot 100u ~1,000 円/mo, initial 500u
~5,000, full 1,000u ~10,000, scale 5,000u ~50,000.

§6.5 explains why 30,000 円 budget alert is ~3x full-ops projection
— headroom for peak + early detection of key-leak abuse.
</commit_message>
<xml_diff>
--- a/docs/operations/Gemini_APIキー作成手順書_Wellfort_v1.0.docx
+++ b/docs/operations/Gemini_APIキー作成手順書_Wellfort_v1.0.docx
@@ -2,7 +2,7 @@
 <file path=word/document.xml><?xml version="1.0" encoding="utf-8"?>
 <w:document xmlns:w="http://schemas.openxmlformats.org/wordprocessingml/2006/main" xmlns:m="http://schemas.openxmlformats.org/officeDocument/2006/math" xmlns:r="http://schemas.openxmlformats.org/officeDocument/2006/relationships" xmlns:o="urn:schemas-microsoft-com:office:office" xmlns:v="urn:schemas-microsoft-com:vml" xmlns:w10="urn:schemas-microsoft-com:office:word" xmlns:a="http://schemas.openxmlformats.org/drawingml/2006/main" xmlns:pic="http://schemas.openxmlformats.org/drawingml/2006/picture" xmlns:wp="http://schemas.openxmlformats.org/drawingml/2006/wordprocessingDrawing">
   <w:body>
-    <w:bookmarkStart w:id="41" w:name="Xe0a602d8d1c01343d52817f2f9aa81bb2c2dc88"/>
+    <w:bookmarkStart w:id="51" w:name="Xe0a602d8d1c01343d52817f2f9aa81bb2c2dc88"/>
     <w:p>
       <w:pPr>
         <w:pStyle w:val="Heading1"/>
@@ -237,7 +237,7 @@
         </w:pict>
       </w:r>
     </w:p>
-    <w:bookmarkStart w:id="22" w:name="Xbffc7f534b764648b7d920ffc36569b02f1b757"/>
+    <w:bookmarkStart w:id="26" w:name="Xbffc7f534b764648b7d920ffc36569b02f1b757"/>
     <w:p>
       <w:pPr>
         <w:pStyle w:val="Heading2"/>
@@ -650,22 +650,268 @@
         <w:t xml:space="preserve">[手順 5]  予算アラートの設定 (推奨)</w:t>
       </w:r>
     </w:p>
-    <w:p>
-      <w:r>
-        <w:pict>
-          <v:rect style="width:0;height:1.5pt" o:hralign="center" o:hrstd="t" o:hr="t"/>
-        </w:pict>
-      </w:r>
-    </w:p>
     <w:bookmarkEnd w:id="21"/>
+    <w:bookmarkStart w:id="25" w:name="Xd8a4f410e04ecfbbc7586925ee732d31aaec9d3"/>
+    <w:p>
+      <w:pPr>
+        <w:pStyle w:val="Heading3"/>
+      </w:pPr>
+      <w:r>
+        <w:t xml:space="preserve">0.3 無料枠 (Free Tier) の取扱い — ⚠️ 本補助事業での重要な注意</w:t>
+      </w:r>
+    </w:p>
+    <w:p>
+      <w:pPr>
+        <w:pStyle w:val="FirstParagraph"/>
+      </w:pPr>
+      <w:r>
+        <w:t xml:space="preserve">Google Gemini API には個人開発・PoC 向けの</w:t>
+      </w:r>
+      <w:r>
+        <w:rPr>
+          <w:bCs/>
+          <w:b/>
+        </w:rPr>
+        <w:t xml:space="preserve">無料枠 (Free Tier)</w:t>
+      </w:r>
+      <w:r>
+        <w:t xml:space="preserve"> </w:t>
+      </w:r>
+      <w:r>
+        <w:t xml:space="preserve">がありますが、</w:t>
+      </w:r>
+      <w:r>
+        <w:rPr>
+          <w:bCs/>
+          <w:b/>
+        </w:rPr>
+        <w:t xml:space="preserve">本補助事業 (医療隣接サービス) の本番運用では原則として利用しません</w:t>
+      </w:r>
+      <w:r>
+        <w:t xml:space="preserve">。理由は以下のとおりです。</w:t>
+      </w:r>
+    </w:p>
+    <w:bookmarkStart w:id="22" w:name="無料枠の概要-2026-年-6-月時点"/>
+    <w:p>
+      <w:pPr>
+        <w:pStyle w:val="Heading4"/>
+      </w:pPr>
+      <w:r>
+        <w:t xml:space="preserve">無料枠の概要 (2026 年 6 月時点)</w:t>
+      </w:r>
+    </w:p>
+    <w:tbl>
+      <w:tblPr>
+        <w:tblStyle w:val="Table"/>
+        <w:tblW w:type="auto" w:w="0"/>
+        <w:tblLook w:firstRow="1" w:lastRow="0" w:firstColumn="0" w:lastColumn="0" w:noHBand="0" w:noVBand="0" w:val="0020"/>
+        <w:jc w:val="start"/>
+      </w:tblPr>
+      <w:tblGrid>
+        <w:gridCol w:w="1584"/>
+        <w:gridCol w:w="1584"/>
+        <w:gridCol w:w="1584"/>
+        <w:gridCol w:w="1584"/>
+        <w:gridCol w:w="1584"/>
+      </w:tblGrid>
+      <w:tr>
+        <w:trPr>
+          <w:tblHeader w:val="true"/>
+        </w:trPr>
+        <w:tc>
+          <w:tcPr/>
+          <w:p>
+            <w:pPr>
+              <w:pStyle w:val="Compact"/>
+              <w:jc w:val="left"/>
+            </w:pPr>
+            <w:r>
+              <w:t xml:space="preserve">モデル</w:t>
+            </w:r>
+          </w:p>
+        </w:tc>
+        <w:tc>
+          <w:tcPr/>
+          <w:p>
+            <w:pPr>
+              <w:pStyle w:val="Compact"/>
+              <w:jc w:val="right"/>
+            </w:pPr>
+            <w:r>
+              <w:t xml:space="preserve">RPM (リクエスト/分)</w:t>
+            </w:r>
+          </w:p>
+        </w:tc>
+        <w:tc>
+          <w:tcPr/>
+          <w:p>
+            <w:pPr>
+              <w:pStyle w:val="Compact"/>
+              <w:jc w:val="right"/>
+            </w:pPr>
+            <w:r>
+              <w:t xml:space="preserve">TPM (トークン/分)</w:t>
+            </w:r>
+          </w:p>
+        </w:tc>
+        <w:tc>
+          <w:tcPr/>
+          <w:p>
+            <w:pPr>
+              <w:pStyle w:val="Compact"/>
+              <w:jc w:val="right"/>
+            </w:pPr>
+            <w:r>
+              <w:t xml:space="preserve">RPD (リクエスト/日)</w:t>
+            </w:r>
+          </w:p>
+        </w:tc>
+        <w:tc>
+          <w:tcPr/>
+          <w:p>
+            <w:pPr>
+              <w:pStyle w:val="Compact"/>
+              <w:jc w:val="right"/>
+            </w:pPr>
+            <w:r>
+              <w:t xml:space="preserve">利用料金</w:t>
+            </w:r>
+          </w:p>
+        </w:tc>
+      </w:tr>
+      <w:tr>
+        <w:tc>
+          <w:tcPr/>
+          <w:p>
+            <w:pPr>
+              <w:pStyle w:val="Compact"/>
+              <w:jc w:val="left"/>
+            </w:pPr>
+            <w:r>
+              <w:t xml:space="preserve">Gemini 2.5 Flash (スキャン・ヘルスコーチ用)</w:t>
+            </w:r>
+          </w:p>
+        </w:tc>
+        <w:tc>
+          <w:tcPr/>
+          <w:p>
+            <w:pPr>
+              <w:pStyle w:val="Compact"/>
+              <w:jc w:val="right"/>
+            </w:pPr>
+            <w:r>
+              <w:t xml:space="preserve">15</w:t>
+            </w:r>
+          </w:p>
+        </w:tc>
+        <w:tc>
+          <w:tcPr/>
+          <w:p>
+            <w:pPr>
+              <w:pStyle w:val="Compact"/>
+              <w:jc w:val="right"/>
+            </w:pPr>
+            <w:r>
+              <w:t xml:space="preserve">1,000,000</w:t>
+            </w:r>
+          </w:p>
+        </w:tc>
+        <w:tc>
+          <w:tcPr/>
+          <w:p>
+            <w:pPr>
+              <w:pStyle w:val="Compact"/>
+              <w:jc w:val="right"/>
+            </w:pPr>
+            <w:r>
+              <w:t xml:space="preserve">1,500</w:t>
+            </w:r>
+          </w:p>
+        </w:tc>
+        <w:tc>
+          <w:tcPr/>
+          <w:p>
+            <w:pPr>
+              <w:pStyle w:val="Compact"/>
+              <w:jc w:val="right"/>
+            </w:pPr>
+            <w:r>
+              <w:t xml:space="preserve">無料</w:t>
+            </w:r>
+          </w:p>
+        </w:tc>
+      </w:tr>
+      <w:tr>
+        <w:tc>
+          <w:tcPr/>
+          <w:p>
+            <w:pPr>
+              <w:pStyle w:val="Compact"/>
+              <w:jc w:val="left"/>
+            </w:pPr>
+            <w:r>
+              <w:t xml:space="preserve">Gemini Live API (AI 問診用)</w:t>
+            </w:r>
+          </w:p>
+        </w:tc>
+        <w:tc>
+          <w:tcPr/>
+          <w:p>
+            <w:pPr>
+              <w:pStyle w:val="Compact"/>
+              <w:jc w:val="right"/>
+            </w:pPr>
+            <w:r>
+              <w:t xml:space="preserve">(限定的)</w:t>
+            </w:r>
+          </w:p>
+        </w:tc>
+        <w:tc>
+          <w:tcPr/>
+          <w:p>
+            <w:pPr>
+              <w:pStyle w:val="Compact"/>
+              <w:jc w:val="right"/>
+            </w:pPr>
+            <w:r>
+              <w:t xml:space="preserve">—</w:t>
+            </w:r>
+          </w:p>
+        </w:tc>
+        <w:tc>
+          <w:tcPr/>
+          <w:p>
+            <w:pPr>
+              <w:pStyle w:val="Compact"/>
+              <w:jc w:val="right"/>
+            </w:pPr>
+            <w:r>
+              <w:t xml:space="preserve">—</w:t>
+            </w:r>
+          </w:p>
+        </w:tc>
+        <w:tc>
+          <w:tcPr/>
+          <w:p>
+            <w:pPr>
+              <w:pStyle w:val="Compact"/>
+              <w:jc w:val="right"/>
+            </w:pPr>
+            <w:r>
+              <w:t xml:space="preserve">無料</w:t>
+            </w:r>
+          </w:p>
+        </w:tc>
+      </w:tr>
+    </w:tbl>
     <w:bookmarkEnd w:id="22"/>
-    <w:bookmarkStart w:id="24" w:name="X53766d820a558aff5c7e5d50c9af3812d5469ff"/>
-    <w:p>
-      <w:pPr>
-        <w:pStyle w:val="Heading2"/>
-      </w:pPr>
-      <w:r>
-        <w:t xml:space="preserve">1. 手順 1 — Generative Language API の有効化</w:t>
+    <w:bookmarkStart w:id="23" w:name="X0c657cfdebd5acd9c1e21496c4177d339134835"/>
+    <w:p>
+      <w:pPr>
+        <w:pStyle w:val="Heading4"/>
+      </w:pPr>
+      <w:r>
+        <w:t xml:space="preserve">⚠️ 無料枠を本番で使ってはいけない最大の理由</w:t>
       </w:r>
     </w:p>
     <w:p>
@@ -673,7 +919,57 @@
         <w:pStyle w:val="FirstParagraph"/>
       </w:pPr>
       <w:r>
-        <w:t xml:space="preserve">API キーを発行する前に、対象 API を有効化する必要があります。</w:t>
+        <w:rPr>
+          <w:bCs/>
+          <w:b/>
+        </w:rPr>
+        <w:t xml:space="preserve">無料枠では送信したデータが Google のモデル学習に使われる</w:t>
+      </w:r>
+      <w:r>
+        <w:t xml:space="preserve"> </w:t>
+      </w:r>
+      <w:r>
+        <w:t xml:space="preserve">ことが規約上明記されています (有料枠では明示的に学習対象外)。</w:t>
+      </w:r>
+    </w:p>
+    <w:p>
+      <w:pPr>
+        <w:pStyle w:val="BodyText"/>
+      </w:pPr>
+      <w:r>
+        <w:t xml:space="preserve">本補助事業では検査結果・氏名・問診内容など</w:t>
+      </w:r>
+      <w:r>
+        <w:t xml:space="preserve"> </w:t>
+      </w:r>
+      <w:r>
+        <w:rPr>
+          <w:bCs/>
+          <w:b/>
+        </w:rPr>
+        <w:t xml:space="preserve">PII (個人特定情報)</w:t>
+      </w:r>
+      <w:r>
+        <w:t xml:space="preserve"> </w:t>
+      </w:r>
+      <w:r>
+        <w:t xml:space="preserve">および</w:t>
+      </w:r>
+      <w:r>
+        <w:t xml:space="preserve"> </w:t>
+      </w:r>
+      <w:r>
+        <w:rPr>
+          <w:bCs/>
+          <w:b/>
+        </w:rPr>
+        <w:t xml:space="preserve">PHI (健康情報)</w:t>
+      </w:r>
+      <w:r>
+        <w:t xml:space="preserve"> </w:t>
+      </w:r>
+      <w:r>
+        <w:t xml:space="preserve">を Gemini に送信するため:</w:t>
       </w:r>
     </w:p>
     <w:p>
@@ -685,12 +981,172 @@
         <w:pStyle w:val="Compact"/>
       </w:pPr>
       <w:r>
+        <w:t xml:space="preserve">❌ 無料枠で運用 →</w:t>
+      </w:r>
+      <w:r>
+        <w:t xml:space="preserve"> </w:t>
+      </w:r>
+      <w:r>
+        <w:rPr>
+          <w:bCs/>
+          <w:b/>
+        </w:rPr>
+        <w:t xml:space="preserve">3 省 2 ガイドライン違反</w:t>
+      </w:r>
+      <w:r>
+        <w:t xml:space="preserve"> </w:t>
+      </w:r>
+      <w:r>
+        <w:t xml:space="preserve">(個人情報の第三者提供 / 利用目的外利用)</w:t>
+      </w:r>
+    </w:p>
+    <w:p>
+      <w:pPr>
+        <w:numPr>
+          <w:ilvl w:val="0"/>
+          <w:numId w:val="1002"/>
+        </w:numPr>
+        <w:pStyle w:val="Compact"/>
+      </w:pPr>
+      <w:r>
+        <w:t xml:space="preserve">✅ 有料枠 (請求アカウント紐付け済) で運用 →</w:t>
+      </w:r>
+      <w:r>
+        <w:t xml:space="preserve"> </w:t>
+      </w:r>
+      <w:r>
+        <w:rPr>
+          <w:bCs/>
+          <w:b/>
+        </w:rPr>
+        <w:t xml:space="preserve">データは学習に使われない</w:t>
+      </w:r>
+      <w:r>
+        <w:t xml:space="preserve"> </w:t>
+      </w:r>
+      <w:r>
+        <w:t xml:space="preserve">ことが契約上保証される</w:t>
+      </w:r>
+    </w:p>
+    <w:p>
+      <w:pPr>
+        <w:pStyle w:val="FirstParagraph"/>
+      </w:pPr>
+      <w:r>
+        <w:t xml:space="preserve">このため、</w:t>
+      </w:r>
+      <w:r>
+        <w:rPr>
+          <w:bCs/>
+          <w:b/>
+        </w:rPr>
+        <w:t xml:space="preserve">請求アカウントが紐付いた状態 = 本番運用に必須</w:t>
+      </w:r>
+      <w:r>
+        <w:t xml:space="preserve"> </w:t>
+      </w:r>
+      <w:r>
+        <w:t xml:space="preserve">の状態であり、本書の手順 1 以降で発行するキーは自動的に有料枠扱いとなります (請求アカウント紐付け済プロジェクトで発行されるため)。</w:t>
+      </w:r>
+    </w:p>
+    <w:bookmarkEnd w:id="23"/>
+    <w:bookmarkStart w:id="24" w:name="無料枠の活用範囲-社内テストpoc-のみ"/>
+    <w:p>
+      <w:pPr>
+        <w:pStyle w:val="Heading4"/>
+      </w:pPr>
+      <w:r>
+        <w:t xml:space="preserve">無料枠の活用範囲 (社内テスト・PoC のみ)</w:t>
+      </w:r>
+    </w:p>
+    <w:p>
+      <w:pPr>
+        <w:numPr>
+          <w:ilvl w:val="0"/>
+          <w:numId w:val="1003"/>
+        </w:numPr>
+        <w:pStyle w:val="Compact"/>
+      </w:pPr>
+      <w:r>
+        <w:t xml:space="preserve">開発エンジニアが手元で動作確認する開発用キー → 無料枠 OK</w:t>
+      </w:r>
+    </w:p>
+    <w:p>
+      <w:pPr>
+        <w:numPr>
+          <w:ilvl w:val="0"/>
+          <w:numId w:val="1003"/>
+        </w:numPr>
+        <w:pStyle w:val="Compact"/>
+      </w:pPr>
+      <w:r>
+        <w:t xml:space="preserve">ダミーデータでのリグレッションテスト → 無料枠 OK</w:t>
+      </w:r>
+    </w:p>
+    <w:p>
+      <w:pPr>
+        <w:numPr>
+          <w:ilvl w:val="0"/>
+          <w:numId w:val="1003"/>
+        </w:numPr>
+        <w:pStyle w:val="Compact"/>
+      </w:pPr>
+      <w:r>
+        <w:t xml:space="preserve">実顧客データを含む本番アクセス →</w:t>
+      </w:r>
+      <w:r>
+        <w:t xml:space="preserve"> </w:t>
+      </w:r>
+      <w:r>
+        <w:rPr>
+          <w:bCs/>
+          <w:b/>
+        </w:rPr>
+        <w:t xml:space="preserve">必ず有料枠</w:t>
+      </w:r>
+    </w:p>
+    <w:p>
+      <w:r>
+        <w:pict>
+          <v:rect style="width:0;height:1.5pt" o:hralign="center" o:hrstd="t" o:hr="t"/>
+        </w:pict>
+      </w:r>
+    </w:p>
+    <w:bookmarkEnd w:id="24"/>
+    <w:bookmarkEnd w:id="25"/>
+    <w:bookmarkEnd w:id="26"/>
+    <w:bookmarkStart w:id="28" w:name="X53766d820a558aff5c7e5d50c9af3812d5469ff"/>
+    <w:p>
+      <w:pPr>
+        <w:pStyle w:val="Heading2"/>
+      </w:pPr>
+      <w:r>
+        <w:t xml:space="preserve">1. 手順 1 — Generative Language API の有効化</w:t>
+      </w:r>
+    </w:p>
+    <w:p>
+      <w:pPr>
+        <w:pStyle w:val="FirstParagraph"/>
+      </w:pPr>
+      <w:r>
+        <w:t xml:space="preserve">API キーを発行する前に、対象 API を有効化する必要があります。</w:t>
+      </w:r>
+    </w:p>
+    <w:p>
+      <w:pPr>
+        <w:numPr>
+          <w:ilvl w:val="0"/>
+          <w:numId w:val="1004"/>
+        </w:numPr>
+        <w:pStyle w:val="Compact"/>
+      </w:pPr>
+      <w:r>
         <w:t xml:space="preserve">Google Cloud Console を開く:</w:t>
       </w:r>
       <w:r>
         <w:t xml:space="preserve"> </w:t>
       </w:r>
-      <w:hyperlink r:id="rId23">
+      <w:hyperlink r:id="rId27">
         <w:r>
           <w:rPr>
             <w:rStyle w:val="Hyperlink"/>
@@ -705,7 +1161,7 @@
       <w:pPr>
         <w:numPr>
           <w:ilvl w:val="0"/>
-          <w:numId w:val="1002"/>
+          <w:numId w:val="1004"/>
         </w:numPr>
         <w:pStyle w:val="Compact"/>
       </w:pPr>
@@ -733,138 +1189,12 @@
       <w:pPr>
         <w:numPr>
           <w:ilvl w:val="1"/>
-          <w:numId w:val="1003"/>
+          <w:numId w:val="1005"/>
         </w:numPr>
         <w:pStyle w:val="Compact"/>
       </w:pPr>
       <w:r>
         <w:t xml:space="preserve">もし別のプロジェクトが選択されている場合は、セレクタをクリックして対象プロジェクトに切替えてください。</w:t>
-      </w:r>
-    </w:p>
-    <w:p>
-      <w:pPr>
-        <w:numPr>
-          <w:ilvl w:val="0"/>
-          <w:numId w:val="1002"/>
-        </w:numPr>
-        <w:pStyle w:val="Compact"/>
-      </w:pPr>
-      <w:r>
-        <w:t xml:space="preserve">検索バーに「</w:t>
-      </w:r>
-      <w:r>
-        <w:rPr>
-          <w:bCs/>
-          <w:b/>
-        </w:rPr>
-        <w:t xml:space="preserve">Generative Language API</w:t>
-      </w:r>
-      <w:r>
-        <w:t xml:space="preserve">」と入力します。</w:t>
-      </w:r>
-    </w:p>
-    <w:p>
-      <w:pPr>
-        <w:numPr>
-          <w:ilvl w:val="0"/>
-          <w:numId w:val="1002"/>
-        </w:numPr>
-        <w:pStyle w:val="Compact"/>
-      </w:pPr>
-      <w:r>
-        <w:t xml:space="preserve">検索結果から「</w:t>
-      </w:r>
-      <w:r>
-        <w:rPr>
-          <w:bCs/>
-          <w:b/>
-        </w:rPr>
-        <w:t xml:space="preserve">Generative Language API</w:t>
-      </w:r>
-      <w:r>
-        <w:t xml:space="preserve">」を選択。</w:t>
-      </w:r>
-    </w:p>
-    <w:p>
-      <w:pPr>
-        <w:numPr>
-          <w:ilvl w:val="0"/>
-          <w:numId w:val="1002"/>
-        </w:numPr>
-        <w:pStyle w:val="Compact"/>
-      </w:pPr>
-      <w:r>
-        <w:t xml:space="preserve">「</w:t>
-      </w:r>
-      <w:r>
-        <w:rPr>
-          <w:bCs/>
-          <w:b/>
-        </w:rPr>
-        <w:t xml:space="preserve">有効にする</w:t>
-      </w:r>
-      <w:r>
-        <w:t xml:space="preserve">」ボタンをクリック。</w:t>
-      </w:r>
-    </w:p>
-    <w:p>
-      <w:pPr>
-        <w:numPr>
-          <w:ilvl w:val="0"/>
-          <w:numId w:val="1002"/>
-        </w:numPr>
-        <w:pStyle w:val="Compact"/>
-      </w:pPr>
-      <w:r>
-        <w:t xml:space="preserve">「API はこのプロジェクトで有効です」と表示されれば完了です。</w:t>
-      </w:r>
-    </w:p>
-    <w:p>
-      <w:pPr>
-        <w:pStyle w:val="BlockText"/>
-      </w:pPr>
-      <w:r>
-        <w:rPr>
-          <w:bCs/>
-          <w:b/>
-        </w:rPr>
-        <w:t xml:space="preserve">💡 補足</w:t>
-      </w:r>
-      <w:r>
-        <w:t xml:space="preserve">: 検索結果に類似名 (Vertex AI 等) が出ますが、本補助事業では</w:t>
-      </w:r>
-      <w:r>
-        <w:t xml:space="preserve"> </w:t>
-      </w:r>
-      <w:r>
-        <w:rPr>
-          <w:bCs/>
-          <w:b/>
-        </w:rPr>
-        <w:t xml:space="preserve">Generative Language API</w:t>
-      </w:r>
-      <w:r>
-        <w:t xml:space="preserve"> </w:t>
-      </w:r>
-      <w:r>
-        <w:t xml:space="preserve">を選んでください。</w:t>
-      </w:r>
-    </w:p>
-    <w:p>
-      <w:r>
-        <w:pict>
-          <v:rect style="width:0;height:1.5pt" o:hralign="center" o:hrstd="t" o:hr="t"/>
-        </w:pict>
-      </w:r>
-    </w:p>
-    <w:bookmarkEnd w:id="24"/>
-    <w:bookmarkStart w:id="26" w:name="X94f74c3a87373cb594fbd7228026023bf1b1940"/>
-    <w:p>
-      <w:pPr>
-        <w:pStyle w:val="Heading2"/>
-      </w:pPr>
-      <w:r>
-        <w:t xml:space="preserve">2. 手順 2 — API キーの発行</w:t>
       </w:r>
     </w:p>
     <w:p>
@@ -876,12 +1206,138 @@
         <w:pStyle w:val="Compact"/>
       </w:pPr>
       <w:r>
+        <w:t xml:space="preserve">検索バーに「</w:t>
+      </w:r>
+      <w:r>
+        <w:rPr>
+          <w:bCs/>
+          <w:b/>
+        </w:rPr>
+        <w:t xml:space="preserve">Generative Language API</w:t>
+      </w:r>
+      <w:r>
+        <w:t xml:space="preserve">」と入力します。</w:t>
+      </w:r>
+    </w:p>
+    <w:p>
+      <w:pPr>
+        <w:numPr>
+          <w:ilvl w:val="0"/>
+          <w:numId w:val="1004"/>
+        </w:numPr>
+        <w:pStyle w:val="Compact"/>
+      </w:pPr>
+      <w:r>
+        <w:t xml:space="preserve">検索結果から「</w:t>
+      </w:r>
+      <w:r>
+        <w:rPr>
+          <w:bCs/>
+          <w:b/>
+        </w:rPr>
+        <w:t xml:space="preserve">Generative Language API</w:t>
+      </w:r>
+      <w:r>
+        <w:t xml:space="preserve">」を選択。</w:t>
+      </w:r>
+    </w:p>
+    <w:p>
+      <w:pPr>
+        <w:numPr>
+          <w:ilvl w:val="0"/>
+          <w:numId w:val="1004"/>
+        </w:numPr>
+        <w:pStyle w:val="Compact"/>
+      </w:pPr>
+      <w:r>
+        <w:t xml:space="preserve">「</w:t>
+      </w:r>
+      <w:r>
+        <w:rPr>
+          <w:bCs/>
+          <w:b/>
+        </w:rPr>
+        <w:t xml:space="preserve">有効にする</w:t>
+      </w:r>
+      <w:r>
+        <w:t xml:space="preserve">」ボタンをクリック。</w:t>
+      </w:r>
+    </w:p>
+    <w:p>
+      <w:pPr>
+        <w:numPr>
+          <w:ilvl w:val="0"/>
+          <w:numId w:val="1004"/>
+        </w:numPr>
+        <w:pStyle w:val="Compact"/>
+      </w:pPr>
+      <w:r>
+        <w:t xml:space="preserve">「API はこのプロジェクトで有効です」と表示されれば完了です。</w:t>
+      </w:r>
+    </w:p>
+    <w:p>
+      <w:pPr>
+        <w:pStyle w:val="BlockText"/>
+      </w:pPr>
+      <w:r>
+        <w:rPr>
+          <w:bCs/>
+          <w:b/>
+        </w:rPr>
+        <w:t xml:space="preserve">💡 補足</w:t>
+      </w:r>
+      <w:r>
+        <w:t xml:space="preserve">: 検索結果に類似名 (Vertex AI 等) が出ますが、本補助事業では</w:t>
+      </w:r>
+      <w:r>
+        <w:t xml:space="preserve"> </w:t>
+      </w:r>
+      <w:r>
+        <w:rPr>
+          <w:bCs/>
+          <w:b/>
+        </w:rPr>
+        <w:t xml:space="preserve">Generative Language API</w:t>
+      </w:r>
+      <w:r>
+        <w:t xml:space="preserve"> </w:t>
+      </w:r>
+      <w:r>
+        <w:t xml:space="preserve">を選んでください。</w:t>
+      </w:r>
+    </w:p>
+    <w:p>
+      <w:r>
+        <w:pict>
+          <v:rect style="width:0;height:1.5pt" o:hralign="center" o:hrstd="t" o:hr="t"/>
+        </w:pict>
+      </w:r>
+    </w:p>
+    <w:bookmarkEnd w:id="28"/>
+    <w:bookmarkStart w:id="30" w:name="X94f74c3a87373cb594fbd7228026023bf1b1940"/>
+    <w:p>
+      <w:pPr>
+        <w:pStyle w:val="Heading2"/>
+      </w:pPr>
+      <w:r>
+        <w:t xml:space="preserve">2. 手順 2 — API キーの発行</w:t>
+      </w:r>
+    </w:p>
+    <w:p>
+      <w:pPr>
+        <w:numPr>
+          <w:ilvl w:val="0"/>
+          <w:numId w:val="1006"/>
+        </w:numPr>
+        <w:pStyle w:val="Compact"/>
+      </w:pPr>
+      <w:r>
         <w:t xml:space="preserve">ブラウザで Google AI Studio を開く:</w:t>
       </w:r>
       <w:r>
         <w:t xml:space="preserve"> </w:t>
       </w:r>
-      <w:hyperlink r:id="rId25">
+      <w:hyperlink r:id="rId29">
         <w:r>
           <w:rPr>
             <w:rStyle w:val="Hyperlink"/>
@@ -896,202 +1352,12 @@
       <w:pPr>
         <w:numPr>
           <w:ilvl w:val="1"/>
-          <w:numId w:val="1005"/>
+          <w:numId w:val="1007"/>
         </w:numPr>
         <w:pStyle w:val="Compact"/>
       </w:pPr>
       <w:r>
         <w:t xml:space="preserve">Wellfort 法人アカウントでログイン中であることを画面右上のアイコンで確認してください。</w:t>
-      </w:r>
-    </w:p>
-    <w:p>
-      <w:pPr>
-        <w:numPr>
-          <w:ilvl w:val="0"/>
-          <w:numId w:val="1004"/>
-        </w:numPr>
-        <w:pStyle w:val="Compact"/>
-      </w:pPr>
-      <w:r>
-        <w:t xml:space="preserve">「</w:t>
-      </w:r>
-      <w:r>
-        <w:rPr>
-          <w:bCs/>
-          <w:b/>
-        </w:rPr>
-        <w:t xml:space="preserve">Create API key</w:t>
-      </w:r>
-      <w:r>
-        <w:t xml:space="preserve">」または「</w:t>
-      </w:r>
-      <w:r>
-        <w:rPr>
-          <w:bCs/>
-          <w:b/>
-        </w:rPr>
-        <w:t xml:space="preserve">API キーを作成</w:t>
-      </w:r>
-      <w:r>
-        <w:t xml:space="preserve">」をクリック。</w:t>
-      </w:r>
-    </w:p>
-    <w:p>
-      <w:pPr>
-        <w:numPr>
-          <w:ilvl w:val="0"/>
-          <w:numId w:val="1004"/>
-        </w:numPr>
-        <w:pStyle w:val="Compact"/>
-      </w:pPr>
-      <w:r>
-        <w:t xml:space="preserve">プロジェクト選択ダイアログで、</w:t>
-      </w:r>
-      <w:r>
-        <w:rPr>
-          <w:bCs/>
-          <w:b/>
-        </w:rPr>
-        <w:t xml:space="preserve">手順 1 で API を有効化したプロジェクト</w:t>
-      </w:r>
-      <w:r>
-        <w:t xml:space="preserve"> </w:t>
-      </w:r>
-      <w:r>
-        <w:t xml:space="preserve">を選択します。</w:t>
-      </w:r>
-    </w:p>
-    <w:p>
-      <w:pPr>
-        <w:numPr>
-          <w:ilvl w:val="0"/>
-          <w:numId w:val="1004"/>
-        </w:numPr>
-        <w:pStyle w:val="Compact"/>
-      </w:pPr>
-      <w:r>
-        <w:t xml:space="preserve">生成された API キー文字列 (例:</w:t>
-      </w:r>
-      <w:r>
-        <w:t xml:space="preserve"> </w:t>
-      </w:r>
-      <w:r>
-        <w:rPr>
-          <w:rStyle w:val="VerbatimChar"/>
-        </w:rPr>
-        <w:t xml:space="preserve">AIzaSy……</w:t>
-      </w:r>
-      <w:r>
-        <w:t xml:space="preserve"> </w:t>
-      </w:r>
-      <w:r>
-        <w:t xml:space="preserve">で始まる 39 文字) が表示されます。</w:t>
-      </w:r>
-    </w:p>
-    <w:p>
-      <w:pPr>
-        <w:numPr>
-          <w:ilvl w:val="0"/>
-          <w:numId w:val="1004"/>
-        </w:numPr>
-        <w:pStyle w:val="Compact"/>
-      </w:pPr>
-      <w:r>
-        <w:rPr>
-          <w:bCs/>
-          <w:b/>
-        </w:rPr>
-        <w:t xml:space="preserve">画面の「Copy」ボタンで API キー全文をコピー</w:t>
-      </w:r>
-      <w:r>
-        <w:t xml:space="preserve"> </w:t>
-      </w:r>
-      <w:r>
-        <w:t xml:space="preserve">してください。</w:t>
-      </w:r>
-    </w:p>
-    <w:p>
-      <w:pPr>
-        <w:pStyle w:val="BlockText"/>
-      </w:pPr>
-      <w:r>
-        <w:rPr>
-          <w:bCs/>
-          <w:b/>
-        </w:rPr>
-        <w:t xml:space="preserve">⚠️ 重要</w:t>
-      </w:r>
-      <w:r>
-        <w:t xml:space="preserve">: API キーは画面に何度でも表示できますが、</w:t>
-      </w:r>
-      <w:r>
-        <w:rPr>
-          <w:bCs/>
-          <w:b/>
-        </w:rPr>
-        <w:t xml:space="preserve">一度漏洩すると不正利用に直結する</w:t>
-      </w:r>
-      <w:r>
-        <w:t xml:space="preserve"> </w:t>
-      </w:r>
-      <w:r>
-        <w:t xml:space="preserve">ため、コピー後は直ちに後述 §4 の方法で安全に保管・引渡してください。</w:t>
-      </w:r>
-    </w:p>
-    <w:p>
-      <w:pPr>
-        <w:pStyle w:val="BlockText"/>
-      </w:pPr>
-      <w:r>
-        <w:rPr>
-          <w:bCs/>
-          <w:b/>
-        </w:rPr>
-        <w:t xml:space="preserve">💡 補足</w:t>
-      </w:r>
-      <w:r>
-        <w:t xml:space="preserve">: AI Studio の画面で確認できる API キー一覧から、後で再表示・名前変更・削除・再生成が可能です。</w:t>
-      </w:r>
-    </w:p>
-    <w:p>
-      <w:r>
-        <w:pict>
-          <v:rect style="width:0;height:1.5pt" o:hralign="center" o:hrstd="t" o:hr="t"/>
-        </w:pict>
-      </w:r>
-    </w:p>
-    <w:bookmarkEnd w:id="26"/>
-    <w:bookmarkStart w:id="28" w:name="X940a62263861f82885fe1b7ca38fc0081dba09b"/>
-    <w:p>
-      <w:pPr>
-        <w:pStyle w:val="Heading2"/>
-      </w:pPr>
-      <w:r>
-        <w:t xml:space="preserve">3. 手順 3 — API キーの制限設定 (強く推奨)</w:t>
-      </w:r>
-    </w:p>
-    <w:p>
-      <w:pPr>
-        <w:pStyle w:val="FirstParagraph"/>
-      </w:pPr>
-      <w:r>
-        <w:t xml:space="preserve">発行直後の API キーは「何にでも使える」状態のため、漏洩リスクを下げるため</w:t>
-      </w:r>
-      <w:r>
-        <w:t xml:space="preserve"> </w:t>
-      </w:r>
-      <w:r>
-        <w:rPr>
-          <w:bCs/>
-          <w:b/>
-        </w:rPr>
-        <w:t xml:space="preserve">利用範囲を Generative Language API に限定</w:t>
-      </w:r>
-      <w:r>
-        <w:t xml:space="preserve"> </w:t>
-      </w:r>
-      <w:r>
-        <w:t xml:space="preserve">することを強く推奨します。</w:t>
       </w:r>
     </w:p>
     <w:p>
@@ -1103,12 +1369,202 @@
         <w:pStyle w:val="Compact"/>
       </w:pPr>
       <w:r>
+        <w:t xml:space="preserve">「</w:t>
+      </w:r>
+      <w:r>
+        <w:rPr>
+          <w:bCs/>
+          <w:b/>
+        </w:rPr>
+        <w:t xml:space="preserve">Create API key</w:t>
+      </w:r>
+      <w:r>
+        <w:t xml:space="preserve">」または「</w:t>
+      </w:r>
+      <w:r>
+        <w:rPr>
+          <w:bCs/>
+          <w:b/>
+        </w:rPr>
+        <w:t xml:space="preserve">API キーを作成</w:t>
+      </w:r>
+      <w:r>
+        <w:t xml:space="preserve">」をクリック。</w:t>
+      </w:r>
+    </w:p>
+    <w:p>
+      <w:pPr>
+        <w:numPr>
+          <w:ilvl w:val="0"/>
+          <w:numId w:val="1006"/>
+        </w:numPr>
+        <w:pStyle w:val="Compact"/>
+      </w:pPr>
+      <w:r>
+        <w:t xml:space="preserve">プロジェクト選択ダイアログで、</w:t>
+      </w:r>
+      <w:r>
+        <w:rPr>
+          <w:bCs/>
+          <w:b/>
+        </w:rPr>
+        <w:t xml:space="preserve">手順 1 で API を有効化したプロジェクト</w:t>
+      </w:r>
+      <w:r>
+        <w:t xml:space="preserve"> </w:t>
+      </w:r>
+      <w:r>
+        <w:t xml:space="preserve">を選択します。</w:t>
+      </w:r>
+    </w:p>
+    <w:p>
+      <w:pPr>
+        <w:numPr>
+          <w:ilvl w:val="0"/>
+          <w:numId w:val="1006"/>
+        </w:numPr>
+        <w:pStyle w:val="Compact"/>
+      </w:pPr>
+      <w:r>
+        <w:t xml:space="preserve">生成された API キー文字列 (例:</w:t>
+      </w:r>
+      <w:r>
+        <w:t xml:space="preserve"> </w:t>
+      </w:r>
+      <w:r>
+        <w:rPr>
+          <w:rStyle w:val="VerbatimChar"/>
+        </w:rPr>
+        <w:t xml:space="preserve">AIzaSy……</w:t>
+      </w:r>
+      <w:r>
+        <w:t xml:space="preserve"> </w:t>
+      </w:r>
+      <w:r>
+        <w:t xml:space="preserve">で始まる 39 文字) が表示されます。</w:t>
+      </w:r>
+    </w:p>
+    <w:p>
+      <w:pPr>
+        <w:numPr>
+          <w:ilvl w:val="0"/>
+          <w:numId w:val="1006"/>
+        </w:numPr>
+        <w:pStyle w:val="Compact"/>
+      </w:pPr>
+      <w:r>
+        <w:rPr>
+          <w:bCs/>
+          <w:b/>
+        </w:rPr>
+        <w:t xml:space="preserve">画面の「Copy」ボタンで API キー全文をコピー</w:t>
+      </w:r>
+      <w:r>
+        <w:t xml:space="preserve"> </w:t>
+      </w:r>
+      <w:r>
+        <w:t xml:space="preserve">してください。</w:t>
+      </w:r>
+    </w:p>
+    <w:p>
+      <w:pPr>
+        <w:pStyle w:val="BlockText"/>
+      </w:pPr>
+      <w:r>
+        <w:rPr>
+          <w:bCs/>
+          <w:b/>
+        </w:rPr>
+        <w:t xml:space="preserve">⚠️ 重要</w:t>
+      </w:r>
+      <w:r>
+        <w:t xml:space="preserve">: API キーは画面に何度でも表示できますが、</w:t>
+      </w:r>
+      <w:r>
+        <w:rPr>
+          <w:bCs/>
+          <w:b/>
+        </w:rPr>
+        <w:t xml:space="preserve">一度漏洩すると不正利用に直結する</w:t>
+      </w:r>
+      <w:r>
+        <w:t xml:space="preserve"> </w:t>
+      </w:r>
+      <w:r>
+        <w:t xml:space="preserve">ため、コピー後は直ちに後述 §4 の方法で安全に保管・引渡してください。</w:t>
+      </w:r>
+    </w:p>
+    <w:p>
+      <w:pPr>
+        <w:pStyle w:val="BlockText"/>
+      </w:pPr>
+      <w:r>
+        <w:rPr>
+          <w:bCs/>
+          <w:b/>
+        </w:rPr>
+        <w:t xml:space="preserve">💡 補足</w:t>
+      </w:r>
+      <w:r>
+        <w:t xml:space="preserve">: AI Studio の画面で確認できる API キー一覧から、後で再表示・名前変更・削除・再生成が可能です。</w:t>
+      </w:r>
+    </w:p>
+    <w:p>
+      <w:r>
+        <w:pict>
+          <v:rect style="width:0;height:1.5pt" o:hralign="center" o:hrstd="t" o:hr="t"/>
+        </w:pict>
+      </w:r>
+    </w:p>
+    <w:bookmarkEnd w:id="30"/>
+    <w:bookmarkStart w:id="32" w:name="X940a62263861f82885fe1b7ca38fc0081dba09b"/>
+    <w:p>
+      <w:pPr>
+        <w:pStyle w:val="Heading2"/>
+      </w:pPr>
+      <w:r>
+        <w:t xml:space="preserve">3. 手順 3 — API キーの制限設定 (強く推奨)</w:t>
+      </w:r>
+    </w:p>
+    <w:p>
+      <w:pPr>
+        <w:pStyle w:val="FirstParagraph"/>
+      </w:pPr>
+      <w:r>
+        <w:t xml:space="preserve">発行直後の API キーは「何にでも使える」状態のため、漏洩リスクを下げるため</w:t>
+      </w:r>
+      <w:r>
+        <w:t xml:space="preserve"> </w:t>
+      </w:r>
+      <w:r>
+        <w:rPr>
+          <w:bCs/>
+          <w:b/>
+        </w:rPr>
+        <w:t xml:space="preserve">利用範囲を Generative Language API に限定</w:t>
+      </w:r>
+      <w:r>
+        <w:t xml:space="preserve"> </w:t>
+      </w:r>
+      <w:r>
+        <w:t xml:space="preserve">することを強く推奨します。</w:t>
+      </w:r>
+    </w:p>
+    <w:p>
+      <w:pPr>
+        <w:numPr>
+          <w:ilvl w:val="0"/>
+          <w:numId w:val="1008"/>
+        </w:numPr>
+        <w:pStyle w:val="Compact"/>
+      </w:pPr>
+      <w:r>
         <w:t xml:space="preserve">Google Cloud Console:</w:t>
       </w:r>
       <w:r>
         <w:t xml:space="preserve"> </w:t>
       </w:r>
-      <w:hyperlink r:id="rId27">
+      <w:hyperlink r:id="rId31">
         <w:r>
           <w:rPr>
             <w:rStyle w:val="Hyperlink"/>
@@ -1123,180 +1579,46 @@
       <w:pPr>
         <w:numPr>
           <w:ilvl w:val="0"/>
-          <w:numId w:val="1006"/>
-        </w:numPr>
-        <w:pStyle w:val="Compact"/>
-      </w:pPr>
-      <w:r>
-        <w:t xml:space="preserve">プロジェクトが正しく選択されていることを確認。</w:t>
-      </w:r>
-    </w:p>
-    <w:p>
-      <w:pPr>
-        <w:numPr>
-          <w:ilvl w:val="0"/>
-          <w:numId w:val="1006"/>
-        </w:numPr>
-        <w:pStyle w:val="Compact"/>
-      </w:pPr>
-      <w:r>
-        <w:t xml:space="preserve">「API キー」一覧から、先ほど作成したキーをクリック。</w:t>
-      </w:r>
-    </w:p>
-    <w:p>
-      <w:pPr>
-        <w:numPr>
-          <w:ilvl w:val="0"/>
-          <w:numId w:val="1006"/>
-        </w:numPr>
-        <w:pStyle w:val="Compact"/>
-      </w:pPr>
-      <w:r>
-        <w:rPr>
-          <w:bCs/>
-          <w:b/>
-        </w:rPr>
-        <w:t xml:space="preserve">キー名</w:t>
-      </w:r>
-      <w:r>
-        <w:t xml:space="preserve"> </w:t>
-      </w:r>
-      <w:r>
-        <w:t xml:space="preserve">を分かりやすい名称に変更:</w:t>
-      </w:r>
-    </w:p>
-    <w:p>
-      <w:pPr>
-        <w:numPr>
-          <w:ilvl w:val="1"/>
-          <w:numId w:val="1007"/>
-        </w:numPr>
-        <w:pStyle w:val="Compact"/>
-      </w:pPr>
-      <w:r>
-        <w:t xml:space="preserve">推奨:</w:t>
-      </w:r>
-      <w:r>
-        <w:t xml:space="preserve"> </w:t>
-      </w:r>
-      <w:r>
-        <w:rPr>
-          <w:rStyle w:val="VerbatimChar"/>
-        </w:rPr>
-        <w:t xml:space="preserve">Wellfort-Scan-Chat-AI-Production-Key</w:t>
-      </w:r>
-    </w:p>
-    <w:p>
-      <w:pPr>
-        <w:numPr>
-          <w:ilvl w:val="0"/>
-          <w:numId w:val="1006"/>
-        </w:numPr>
-        <w:pStyle w:val="Compact"/>
-      </w:pPr>
-      <w:r>
-        <w:rPr>
-          <w:bCs/>
-          <w:b/>
-        </w:rPr>
-        <w:t xml:space="preserve">「API の制限」セクション</w:t>
-      </w:r>
-      <w:r>
-        <w:t xml:space="preserve">:</w:t>
-      </w:r>
-    </w:p>
-    <w:p>
-      <w:pPr>
-        <w:numPr>
-          <w:ilvl w:val="1"/>
           <w:numId w:val="1008"/>
         </w:numPr>
         <w:pStyle w:val="Compact"/>
       </w:pPr>
       <w:r>
-        <w:t xml:space="preserve">「</w:t>
-      </w:r>
-      <w:r>
-        <w:rPr>
-          <w:bCs/>
-          <w:b/>
-        </w:rPr>
-        <w:t xml:space="preserve">キーを制限</w:t>
-      </w:r>
-      <w:r>
-        <w:t xml:space="preserve">」を選択</w:t>
+        <w:t xml:space="preserve">プロジェクトが正しく選択されていることを確認。</w:t>
       </w:r>
     </w:p>
     <w:p>
       <w:pPr>
         <w:numPr>
-          <w:ilvl w:val="1"/>
+          <w:ilvl w:val="0"/>
           <w:numId w:val="1008"/>
         </w:numPr>
         <w:pStyle w:val="Compact"/>
       </w:pPr>
       <w:r>
-        <w:t xml:space="preserve">リストから「</w:t>
-      </w:r>
-      <w:r>
-        <w:rPr>
-          <w:bCs/>
-          <w:b/>
-        </w:rPr>
-        <w:t xml:space="preserve">Generative Language API</w:t>
-      </w:r>
-      <w:r>
-        <w:t xml:space="preserve">」のみにチェック</w:t>
+        <w:t xml:space="preserve">「API キー」一覧から、先ほど作成したキーをクリック。</w:t>
       </w:r>
     </w:p>
     <w:p>
       <w:pPr>
         <w:numPr>
-          <w:ilvl w:val="1"/>
+          <w:ilvl w:val="0"/>
           <w:numId w:val="1008"/>
         </w:numPr>
         <w:pStyle w:val="Compact"/>
       </w:pPr>
       <w:r>
-        <w:t xml:space="preserve">「保存」をクリック</w:t>
-      </w:r>
-    </w:p>
-    <w:p>
-      <w:pPr>
-        <w:numPr>
-          <w:ilvl w:val="0"/>
-          <w:numId w:val="1006"/>
-        </w:numPr>
-        <w:pStyle w:val="Compact"/>
-      </w:pPr>
-      <w:r>
         <w:rPr>
           <w:bCs/>
           <w:b/>
         </w:rPr>
-        <w:t xml:space="preserve">「アプリケーションの制限」セクション</w:t>
+        <w:t xml:space="preserve">キー名</w:t>
       </w:r>
       <w:r>
         <w:t xml:space="preserve"> </w:t>
       </w:r>
       <w:r>
-        <w:t xml:space="preserve">は</w:t>
-      </w:r>
-      <w:r>
-        <w:t xml:space="preserve"> </w:t>
-      </w:r>
-      <w:r>
-        <w:rPr>
-          <w:bCs/>
-          <w:b/>
-        </w:rPr>
-        <w:t xml:space="preserve">「なし」のまま</w:t>
-      </w:r>
-      <w:r>
-        <w:t xml:space="preserve"> </w:t>
-      </w:r>
-      <w:r>
-        <w:t xml:space="preserve">で構いません。</w:t>
+        <w:t xml:space="preserve">を分かりやすい名称に変更:</w:t>
       </w:r>
     </w:p>
     <w:p>
@@ -1308,14 +1630,148 @@
         <w:pStyle w:val="Compact"/>
       </w:pPr>
       <w:r>
-        <w:t xml:space="preserve">Vercel のサーバから呼び出すため、固定 IP 制限は実用的でない (Vercel の egress IP は変動するため)</w:t>
+        <w:t xml:space="preserve">推奨:</w:t>
+      </w:r>
+      <w:r>
+        <w:t xml:space="preserve"> </w:t>
+      </w:r>
+      <w:r>
+        <w:rPr>
+          <w:rStyle w:val="VerbatimChar"/>
+        </w:rPr>
+        <w:t xml:space="preserve">Wellfort-Scan-Chat-AI-Production-Key</w:t>
+      </w:r>
+    </w:p>
+    <w:p>
+      <w:pPr>
+        <w:numPr>
+          <w:ilvl w:val="0"/>
+          <w:numId w:val="1008"/>
+        </w:numPr>
+        <w:pStyle w:val="Compact"/>
+      </w:pPr>
+      <w:r>
+        <w:rPr>
+          <w:bCs/>
+          <w:b/>
+        </w:rPr>
+        <w:t xml:space="preserve">「API の制限」セクション</w:t>
+      </w:r>
+      <w:r>
+        <w:t xml:space="preserve">:</w:t>
       </w:r>
     </w:p>
     <w:p>
       <w:pPr>
         <w:numPr>
           <w:ilvl w:val="1"/>
-          <w:numId w:val="1009"/>
+          <w:numId w:val="1010"/>
+        </w:numPr>
+        <w:pStyle w:val="Compact"/>
+      </w:pPr>
+      <w:r>
+        <w:t xml:space="preserve">「</w:t>
+      </w:r>
+      <w:r>
+        <w:rPr>
+          <w:bCs/>
+          <w:b/>
+        </w:rPr>
+        <w:t xml:space="preserve">キーを制限</w:t>
+      </w:r>
+      <w:r>
+        <w:t xml:space="preserve">」を選択</w:t>
+      </w:r>
+    </w:p>
+    <w:p>
+      <w:pPr>
+        <w:numPr>
+          <w:ilvl w:val="1"/>
+          <w:numId w:val="1010"/>
+        </w:numPr>
+        <w:pStyle w:val="Compact"/>
+      </w:pPr>
+      <w:r>
+        <w:t xml:space="preserve">リストから「</w:t>
+      </w:r>
+      <w:r>
+        <w:rPr>
+          <w:bCs/>
+          <w:b/>
+        </w:rPr>
+        <w:t xml:space="preserve">Generative Language API</w:t>
+      </w:r>
+      <w:r>
+        <w:t xml:space="preserve">」のみにチェック</w:t>
+      </w:r>
+    </w:p>
+    <w:p>
+      <w:pPr>
+        <w:numPr>
+          <w:ilvl w:val="1"/>
+          <w:numId w:val="1010"/>
+        </w:numPr>
+        <w:pStyle w:val="Compact"/>
+      </w:pPr>
+      <w:r>
+        <w:t xml:space="preserve">「保存」をクリック</w:t>
+      </w:r>
+    </w:p>
+    <w:p>
+      <w:pPr>
+        <w:numPr>
+          <w:ilvl w:val="0"/>
+          <w:numId w:val="1008"/>
+        </w:numPr>
+        <w:pStyle w:val="Compact"/>
+      </w:pPr>
+      <w:r>
+        <w:rPr>
+          <w:bCs/>
+          <w:b/>
+        </w:rPr>
+        <w:t xml:space="preserve">「アプリケーションの制限」セクション</w:t>
+      </w:r>
+      <w:r>
+        <w:t xml:space="preserve"> </w:t>
+      </w:r>
+      <w:r>
+        <w:t xml:space="preserve">は</w:t>
+      </w:r>
+      <w:r>
+        <w:t xml:space="preserve"> </w:t>
+      </w:r>
+      <w:r>
+        <w:rPr>
+          <w:bCs/>
+          <w:b/>
+        </w:rPr>
+        <w:t xml:space="preserve">「なし」のまま</w:t>
+      </w:r>
+      <w:r>
+        <w:t xml:space="preserve"> </w:t>
+      </w:r>
+      <w:r>
+        <w:t xml:space="preserve">で構いません。</w:t>
+      </w:r>
+    </w:p>
+    <w:p>
+      <w:pPr>
+        <w:numPr>
+          <w:ilvl w:val="1"/>
+          <w:numId w:val="1011"/>
+        </w:numPr>
+        <w:pStyle w:val="Compact"/>
+      </w:pPr>
+      <w:r>
+        <w:t xml:space="preserve">Vercel のサーバから呼び出すため、固定 IP 制限は実用的でない (Vercel の egress IP は変動するため)</w:t>
+      </w:r>
+    </w:p>
+    <w:p>
+      <w:pPr>
+        <w:numPr>
+          <w:ilvl w:val="1"/>
+          <w:numId w:val="1011"/>
         </w:numPr>
         <w:pStyle w:val="Compact"/>
       </w:pPr>
@@ -1330,8 +1786,8 @@
         </w:pict>
       </w:r>
     </w:p>
-    <w:bookmarkEnd w:id="28"/>
-    <w:bookmarkStart w:id="32" w:name="Xe15beed8e03e48bfb167f11a424b1e919f2585c"/>
+    <w:bookmarkEnd w:id="32"/>
+    <w:bookmarkStart w:id="36" w:name="Xe15beed8e03e48bfb167f11a424b1e919f2585c"/>
     <w:p>
       <w:pPr>
         <w:pStyle w:val="Heading2"/>
@@ -1364,7 +1820,7 @@
         <w:t xml:space="preserve">に直結します。以下の方法で安全に引渡してください。</w:t>
       </w:r>
     </w:p>
-    <w:bookmarkStart w:id="29" w:name="X24edb461cac851fa9760012fba15010569f91d5"/>
+    <w:bookmarkStart w:id="33" w:name="X24edb461cac851fa9760012fba15010569f91d5"/>
     <w:p>
       <w:pPr>
         <w:pStyle w:val="Heading3"/>
@@ -1601,216 +2057,14 @@
         </w:tc>
       </w:tr>
     </w:tbl>
-    <w:bookmarkEnd w:id="29"/>
-    <w:bookmarkStart w:id="30" w:name="Xa5d775f0133c8b3f4b2cb27e07b10bf8926b9cc"/>
+    <w:bookmarkEnd w:id="33"/>
+    <w:bookmarkStart w:id="34" w:name="Xa5d775f0133c8b3f4b2cb27e07b10bf8926b9cc"/>
     <w:p>
       <w:pPr>
         <w:pStyle w:val="Heading3"/>
       </w:pPr>
       <w:r>
         <w:t xml:space="preserve">4.2 絶対に避けてください</w:t>
-      </w:r>
-    </w:p>
-    <w:p>
-      <w:pPr>
-        <w:numPr>
-          <w:ilvl w:val="0"/>
-          <w:numId w:val="1010"/>
-        </w:numPr>
-        <w:pStyle w:val="Compact"/>
-      </w:pPr>
-      <w:r>
-        <w:t xml:space="preserve">❌ メール本文への平文での貼付 (送信履歴に残る)</w:t>
-      </w:r>
-    </w:p>
-    <w:p>
-      <w:pPr>
-        <w:numPr>
-          <w:ilvl w:val="0"/>
-          <w:numId w:val="1010"/>
-        </w:numPr>
-        <w:pStyle w:val="Compact"/>
-      </w:pPr>
-      <w:r>
-        <w:t xml:space="preserve">❌ チャット公開チャンネル / メーリングリストへの貼付</w:t>
-      </w:r>
-    </w:p>
-    <w:p>
-      <w:pPr>
-        <w:numPr>
-          <w:ilvl w:val="0"/>
-          <w:numId w:val="1010"/>
-        </w:numPr>
-        <w:pStyle w:val="Compact"/>
-      </w:pPr>
-      <w:r>
-        <w:t xml:space="preserve">❌ Word / Excel / PowerPoint ファイルへの記載 + メール添付</w:t>
-      </w:r>
-    </w:p>
-    <w:p>
-      <w:pPr>
-        <w:numPr>
-          <w:ilvl w:val="0"/>
-          <w:numId w:val="1010"/>
-        </w:numPr>
-        <w:pStyle w:val="Compact"/>
-      </w:pPr>
-      <w:r>
-        <w:t xml:space="preserve">❌ スクリーンショットでの送信 (画像ファイル管理が雑になる)</w:t>
-      </w:r>
-    </w:p>
-    <w:p>
-      <w:pPr>
-        <w:numPr>
-          <w:ilvl w:val="0"/>
-          <w:numId w:val="1010"/>
-        </w:numPr>
-        <w:pStyle w:val="Compact"/>
-      </w:pPr>
-      <w:r>
-        <w:t xml:space="preserve">❌ クラウドストレージへの「リンクを知っている全員」共有</w:t>
-      </w:r>
-    </w:p>
-    <w:bookmarkEnd w:id="30"/>
-    <w:bookmarkStart w:id="31" w:name="X55693e72bd940b94685ee2430323bc4fcba3309"/>
-    <w:p>
-      <w:pPr>
-        <w:pStyle w:val="Heading3"/>
-      </w:pPr>
-      <w:r>
-        <w:t xml:space="preserve">4.3 引渡し後の運用</w:t>
-      </w:r>
-    </w:p>
-    <w:p>
-      <w:pPr>
-        <w:numPr>
-          <w:ilvl w:val="0"/>
-          <w:numId w:val="1011"/>
-        </w:numPr>
-        <w:pStyle w:val="Compact"/>
-      </w:pPr>
-      <w:r>
-        <w:t xml:space="preserve">UNFIX 担当者は受領した API キーを</w:t>
-      </w:r>
-      <w:r>
-        <w:t xml:space="preserve"> </w:t>
-      </w:r>
-      <w:r>
-        <w:rPr>
-          <w:bCs/>
-          <w:b/>
-        </w:rPr>
-        <w:t xml:space="preserve">Vercel 本番環境の環境変数</w:t>
-      </w:r>
-      <w:r>
-        <w:rPr>
-          <w:bCs/>
-          <w:b/>
-        </w:rPr>
-        <w:t xml:space="preserve"> </w:t>
-      </w:r>
-      <w:r>
-        <w:rPr>
-          <w:rStyle w:val="VerbatimChar"/>
-          <w:bCs/>
-          <w:b/>
-        </w:rPr>
-        <w:t xml:space="preserve">GEMINI_API_KEY</w:t>
-      </w:r>
-      <w:r>
-        <w:t xml:space="preserve"> </w:t>
-      </w:r>
-      <w:r>
-        <w:t xml:space="preserve">に設定します。</w:t>
-      </w:r>
-    </w:p>
-    <w:p>
-      <w:pPr>
-        <w:numPr>
-          <w:ilvl w:val="0"/>
-          <w:numId w:val="1011"/>
-        </w:numPr>
-        <w:pStyle w:val="Compact"/>
-      </w:pPr>
-      <w:r>
-        <w:t xml:space="preserve">Wellfort 側でも API キー本体を</w:t>
-      </w:r>
-      <w:r>
-        <w:t xml:space="preserve"> </w:t>
-      </w:r>
-      <w:r>
-        <w:rPr>
-          <w:bCs/>
-          <w:b/>
-        </w:rPr>
-        <w:t xml:space="preserve">法人パスワードマネージャ</w:t>
-      </w:r>
-      <w:r>
-        <w:t xml:space="preserve"> </w:t>
-      </w:r>
-      <w:r>
-        <w:t xml:space="preserve">に保管してください (緊急時の再発行・キーローテーションのため)。</w:t>
-      </w:r>
-    </w:p>
-    <w:p>
-      <w:pPr>
-        <w:numPr>
-          <w:ilvl w:val="0"/>
-          <w:numId w:val="1011"/>
-        </w:numPr>
-        <w:pStyle w:val="Compact"/>
-      </w:pPr>
-      <w:r>
-        <w:rPr>
-          <w:bCs/>
-          <w:b/>
-        </w:rPr>
-        <w:t xml:space="preserve">3 か月に 1 回程度</w:t>
-      </w:r>
-      <w:r>
-        <w:t xml:space="preserve"> </w:t>
-      </w:r>
-      <w:r>
-        <w:t xml:space="preserve">、API キーのローテーション (再発行 + 環境変数更新) を推奨します。</w:t>
-      </w:r>
-    </w:p>
-    <w:p>
-      <w:r>
-        <w:pict>
-          <v:rect style="width:0;height:1.5pt" o:hralign="center" o:hrstd="t" o:hr="t"/>
-        </w:pict>
-      </w:r>
-    </w:p>
-    <w:bookmarkEnd w:id="31"/>
-    <w:bookmarkEnd w:id="32"/>
-    <w:bookmarkStart w:id="34" w:name="X70570c70ad27f5c0847af704e6d75ecf2c54633"/>
-    <w:p>
-      <w:pPr>
-        <w:pStyle w:val="Heading2"/>
-      </w:pPr>
-      <w:r>
-        <w:t xml:space="preserve">5. 手順 5 — 予算アラートの設定 (強く推奨)</w:t>
-      </w:r>
-    </w:p>
-    <w:p>
-      <w:pPr>
-        <w:pStyle w:val="FirstParagraph"/>
-      </w:pPr>
-      <w:r>
-        <w:t xml:space="preserve">予期しない請求を防ぐため、</w:t>
-      </w:r>
-      <w:r>
-        <w:rPr>
-          <w:bCs/>
-          <w:b/>
-        </w:rPr>
-        <w:t xml:space="preserve">予算アラート</w:t>
-      </w:r>
-      <w:r>
-        <w:t xml:space="preserve"> </w:t>
-      </w:r>
-      <w:r>
-        <w:t xml:space="preserve">を設定してください。</w:t>
       </w:r>
     </w:p>
     <w:p>
@@ -1822,34 +2076,236 @@
         <w:pStyle w:val="Compact"/>
       </w:pPr>
       <w:r>
-        <w:t xml:space="preserve">Google Cloud Console &gt;</w:t>
-      </w:r>
-      <w:r>
-        <w:t xml:space="preserve"> </w:t>
-      </w:r>
-      <w:r>
-        <w:rPr>
-          <w:bCs/>
-          <w:b/>
-        </w:rPr>
-        <w:t xml:space="preserve">「請求」 &gt; 「予算とアラート」</w:t>
+        <w:t xml:space="preserve">❌ メール本文への平文での貼付 (送信履歴に残る)</w:t>
       </w:r>
     </w:p>
     <w:p>
       <w:pPr>
         <w:numPr>
-          <w:ilvl w:val="1"/>
+          <w:ilvl w:val="0"/>
+          <w:numId w:val="1012"/>
+        </w:numPr>
+        <w:pStyle w:val="Compact"/>
+      </w:pPr>
+      <w:r>
+        <w:t xml:space="preserve">❌ チャット公開チャンネル / メーリングリストへの貼付</w:t>
+      </w:r>
+    </w:p>
+    <w:p>
+      <w:pPr>
+        <w:numPr>
+          <w:ilvl w:val="0"/>
+          <w:numId w:val="1012"/>
+        </w:numPr>
+        <w:pStyle w:val="Compact"/>
+      </w:pPr>
+      <w:r>
+        <w:t xml:space="preserve">❌ Word / Excel / PowerPoint ファイルへの記載 + メール添付</w:t>
+      </w:r>
+    </w:p>
+    <w:p>
+      <w:pPr>
+        <w:numPr>
+          <w:ilvl w:val="0"/>
+          <w:numId w:val="1012"/>
+        </w:numPr>
+        <w:pStyle w:val="Compact"/>
+      </w:pPr>
+      <w:r>
+        <w:t xml:space="preserve">❌ スクリーンショットでの送信 (画像ファイル管理が雑になる)</w:t>
+      </w:r>
+    </w:p>
+    <w:p>
+      <w:pPr>
+        <w:numPr>
+          <w:ilvl w:val="0"/>
+          <w:numId w:val="1012"/>
+        </w:numPr>
+        <w:pStyle w:val="Compact"/>
+      </w:pPr>
+      <w:r>
+        <w:t xml:space="preserve">❌ クラウドストレージへの「リンクを知っている全員」共有</w:t>
+      </w:r>
+    </w:p>
+    <w:bookmarkEnd w:id="34"/>
+    <w:bookmarkStart w:id="35" w:name="X55693e72bd940b94685ee2430323bc4fcba3309"/>
+    <w:p>
+      <w:pPr>
+        <w:pStyle w:val="Heading3"/>
+      </w:pPr>
+      <w:r>
+        <w:t xml:space="preserve">4.3 引渡し後の運用</w:t>
+      </w:r>
+    </w:p>
+    <w:p>
+      <w:pPr>
+        <w:numPr>
+          <w:ilvl w:val="0"/>
           <w:numId w:val="1013"/>
         </w:numPr>
         <w:pStyle w:val="Compact"/>
       </w:pPr>
       <w:r>
+        <w:t xml:space="preserve">UNFIX 担当者は受領した API キーを</w:t>
+      </w:r>
+      <w:r>
+        <w:t xml:space="preserve"> </w:t>
+      </w:r>
+      <w:r>
+        <w:rPr>
+          <w:bCs/>
+          <w:b/>
+        </w:rPr>
+        <w:t xml:space="preserve">Vercel 本番環境の環境変数</w:t>
+      </w:r>
+      <w:r>
+        <w:rPr>
+          <w:bCs/>
+          <w:b/>
+        </w:rPr>
+        <w:t xml:space="preserve"> </w:t>
+      </w:r>
+      <w:r>
+        <w:rPr>
+          <w:rStyle w:val="VerbatimChar"/>
+          <w:bCs/>
+          <w:b/>
+        </w:rPr>
+        <w:t xml:space="preserve">GEMINI_API_KEY</w:t>
+      </w:r>
+      <w:r>
+        <w:t xml:space="preserve"> </w:t>
+      </w:r>
+      <w:r>
+        <w:t xml:space="preserve">に設定します。</w:t>
+      </w:r>
+    </w:p>
+    <w:p>
+      <w:pPr>
+        <w:numPr>
+          <w:ilvl w:val="0"/>
+          <w:numId w:val="1013"/>
+        </w:numPr>
+        <w:pStyle w:val="Compact"/>
+      </w:pPr>
+      <w:r>
+        <w:t xml:space="preserve">Wellfort 側でも API キー本体を</w:t>
+      </w:r>
+      <w:r>
+        <w:t xml:space="preserve"> </w:t>
+      </w:r>
+      <w:r>
+        <w:rPr>
+          <w:bCs/>
+          <w:b/>
+        </w:rPr>
+        <w:t xml:space="preserve">法人パスワードマネージャ</w:t>
+      </w:r>
+      <w:r>
+        <w:t xml:space="preserve"> </w:t>
+      </w:r>
+      <w:r>
+        <w:t xml:space="preserve">に保管してください (緊急時の再発行・キーローテーションのため)。</w:t>
+      </w:r>
+    </w:p>
+    <w:p>
+      <w:pPr>
+        <w:numPr>
+          <w:ilvl w:val="0"/>
+          <w:numId w:val="1013"/>
+        </w:numPr>
+        <w:pStyle w:val="Compact"/>
+      </w:pPr>
+      <w:r>
+        <w:rPr>
+          <w:bCs/>
+          <w:b/>
+        </w:rPr>
+        <w:t xml:space="preserve">3 か月に 1 回程度</w:t>
+      </w:r>
+      <w:r>
+        <w:t xml:space="preserve"> </w:t>
+      </w:r>
+      <w:r>
+        <w:t xml:space="preserve">、API キーのローテーション (再発行 + 環境変数更新) を推奨します。</w:t>
+      </w:r>
+    </w:p>
+    <w:p>
+      <w:r>
+        <w:pict>
+          <v:rect style="width:0;height:1.5pt" o:hralign="center" o:hrstd="t" o:hr="t"/>
+        </w:pict>
+      </w:r>
+    </w:p>
+    <w:bookmarkEnd w:id="35"/>
+    <w:bookmarkEnd w:id="36"/>
+    <w:bookmarkStart w:id="38" w:name="X70570c70ad27f5c0847af704e6d75ecf2c54633"/>
+    <w:p>
+      <w:pPr>
+        <w:pStyle w:val="Heading2"/>
+      </w:pPr>
+      <w:r>
+        <w:t xml:space="preserve">5. 手順 5 — 予算アラートの設定 (強く推奨)</w:t>
+      </w:r>
+    </w:p>
+    <w:p>
+      <w:pPr>
+        <w:pStyle w:val="FirstParagraph"/>
+      </w:pPr>
+      <w:r>
+        <w:t xml:space="preserve">予期しない請求を防ぐため、</w:t>
+      </w:r>
+      <w:r>
+        <w:rPr>
+          <w:bCs/>
+          <w:b/>
+        </w:rPr>
+        <w:t xml:space="preserve">予算アラート</w:t>
+      </w:r>
+      <w:r>
+        <w:t xml:space="preserve"> </w:t>
+      </w:r>
+      <w:r>
+        <w:t xml:space="preserve">を設定してください。</w:t>
+      </w:r>
+    </w:p>
+    <w:p>
+      <w:pPr>
+        <w:numPr>
+          <w:ilvl w:val="0"/>
+          <w:numId w:val="1014"/>
+        </w:numPr>
+        <w:pStyle w:val="Compact"/>
+      </w:pPr>
+      <w:r>
+        <w:t xml:space="preserve">Google Cloud Console &gt;</w:t>
+      </w:r>
+      <w:r>
+        <w:t xml:space="preserve"> </w:t>
+      </w:r>
+      <w:r>
+        <w:rPr>
+          <w:bCs/>
+          <w:b/>
+        </w:rPr>
+        <w:t xml:space="preserve">「請求」 &gt; 「予算とアラート」</w:t>
+      </w:r>
+    </w:p>
+    <w:p>
+      <w:pPr>
+        <w:numPr>
+          <w:ilvl w:val="1"/>
+          <w:numId w:val="1015"/>
+        </w:numPr>
+        <w:pStyle w:val="Compact"/>
+      </w:pPr>
+      <w:r>
         <w:t xml:space="preserve">URL:</w:t>
       </w:r>
       <w:r>
         <w:t xml:space="preserve"> </w:t>
       </w:r>
-      <w:hyperlink r:id="rId33">
+      <w:hyperlink r:id="rId37">
         <w:r>
           <w:rPr>
             <w:rStyle w:val="Hyperlink"/>
@@ -1864,7 +2320,7 @@
       <w:pPr>
         <w:numPr>
           <w:ilvl w:val="0"/>
-          <w:numId w:val="1012"/>
+          <w:numId w:val="1014"/>
         </w:numPr>
         <w:pStyle w:val="Compact"/>
       </w:pPr>
@@ -1880,149 +2336,6 @@
       </w:r>
       <w:r>
         <w:t xml:space="preserve">」をクリック。</w:t>
-      </w:r>
-    </w:p>
-    <w:p>
-      <w:pPr>
-        <w:numPr>
-          <w:ilvl w:val="0"/>
-          <w:numId w:val="1012"/>
-        </w:numPr>
-        <w:pStyle w:val="Compact"/>
-      </w:pPr>
-      <w:r>
-        <w:t xml:space="preserve">予算名:</w:t>
-      </w:r>
-      <w:r>
-        <w:t xml:space="preserve"> </w:t>
-      </w:r>
-      <w:r>
-        <w:rPr>
-          <w:rStyle w:val="VerbatimChar"/>
-        </w:rPr>
-        <w:t xml:space="preserve">Wellfort Gemini API 月次予算</w:t>
-      </w:r>
-    </w:p>
-    <w:p>
-      <w:pPr>
-        <w:numPr>
-          <w:ilvl w:val="0"/>
-          <w:numId w:val="1012"/>
-        </w:numPr>
-        <w:pStyle w:val="Compact"/>
-      </w:pPr>
-      <w:r>
-        <w:t xml:space="preserve">対象: 本補助事業用プロジェクトを指定。</w:t>
-      </w:r>
-    </w:p>
-    <w:p>
-      <w:pPr>
-        <w:numPr>
-          <w:ilvl w:val="0"/>
-          <w:numId w:val="1012"/>
-        </w:numPr>
-        <w:pStyle w:val="Compact"/>
-      </w:pPr>
-      <w:r>
-        <w:t xml:space="preserve">予算額:</w:t>
-      </w:r>
-      <w:r>
-        <w:t xml:space="preserve"> </w:t>
-      </w:r>
-      <w:r>
-        <w:rPr>
-          <w:bCs/>
-          <w:b/>
-        </w:rPr>
-        <w:t xml:space="preserve">30,000 円 / 月</w:t>
-      </w:r>
-      <w:r>
-        <w:t xml:space="preserve"> </w:t>
-      </w:r>
-      <w:r>
-        <w:t xml:space="preserve">(推奨初期値・必要に応じて調整)</w:t>
-      </w:r>
-    </w:p>
-    <w:p>
-      <w:pPr>
-        <w:numPr>
-          <w:ilvl w:val="0"/>
-          <w:numId w:val="1012"/>
-        </w:numPr>
-        <w:pStyle w:val="Compact"/>
-      </w:pPr>
-      <w:r>
-        <w:t xml:space="preserve">アラートのしきい値:</w:t>
-      </w:r>
-      <w:r>
-        <w:t xml:space="preserve"> </w:t>
-      </w:r>
-      <w:r>
-        <w:rPr>
-          <w:bCs/>
-          <w:b/>
-        </w:rPr>
-        <w:t xml:space="preserve">50% / 90% / 100%</w:t>
-      </w:r>
-      <w:r>
-        <w:t xml:space="preserve"> </w:t>
-      </w:r>
-      <w:r>
-        <w:t xml:space="preserve">で通知する設定を有効化。</w:t>
-      </w:r>
-    </w:p>
-    <w:p>
-      <w:pPr>
-        <w:numPr>
-          <w:ilvl w:val="0"/>
-          <w:numId w:val="1012"/>
-        </w:numPr>
-        <w:pStyle w:val="Compact"/>
-      </w:pPr>
-      <w:r>
-        <w:t xml:space="preserve">通知先メールアドレス:</w:t>
-      </w:r>
-      <w:r>
-        <w:t xml:space="preserve"> </w:t>
-      </w:r>
-      <w:r>
-        <w:rPr>
-          <w:bCs/>
-          <w:b/>
-        </w:rPr>
-        <w:t xml:space="preserve">Wellfort 担当者 + UNFIX 担当者の双方</w:t>
-      </w:r>
-      <w:r>
-        <w:t xml:space="preserve"> </w:t>
-      </w:r>
-      <w:r>
-        <w:t xml:space="preserve">を登録。</w:t>
-      </w:r>
-    </w:p>
-    <w:p>
-      <w:r>
-        <w:pict>
-          <v:rect style="width:0;height:1.5pt" o:hralign="center" o:hrstd="t" o:hr="t"/>
-        </w:pict>
-      </w:r>
-    </w:p>
-    <w:bookmarkEnd w:id="34"/>
-    <w:bookmarkStart w:id="37" w:name="X162f4c9d316f2914f93a8ffe1187a770c8663ff"/>
-    <w:p>
-      <w:pPr>
-        <w:pStyle w:val="Heading2"/>
-      </w:pPr>
-      <w:r>
-        <w:t xml:space="preserve">6. 利用量の監視 (運用開始後)</w:t>
-      </w:r>
-    </w:p>
-    <w:bookmarkStart w:id="35" w:name="Xd1259937d747614382e2cf555247acbdbaadf41"/>
-    <w:p>
-      <w:pPr>
-        <w:pStyle w:val="Heading3"/>
-      </w:pPr>
-      <w:r>
-        <w:t xml:space="preserve">6.1 利用ダッシュボード</w:t>
       </w:r>
     </w:p>
     <w:p>
@@ -2034,23 +2347,16 @@
         <w:pStyle w:val="Compact"/>
       </w:pPr>
       <w:r>
-        <w:t xml:space="preserve">Google Cloud Console &gt;</w:t>
+        <w:t xml:space="preserve">予算名:</w:t>
       </w:r>
       <w:r>
         <w:t xml:space="preserve"> </w:t>
       </w:r>
       <w:r>
         <w:rPr>
-          <w:bCs/>
-          <w:b/>
-        </w:rPr>
-        <w:t xml:space="preserve">「API とサービス」 &gt; 「ダッシュボード」</w:t>
-      </w:r>
-      <w:r>
-        <w:t xml:space="preserve"> </w:t>
-      </w:r>
-      <w:r>
-        <w:t xml:space="preserve">→ 過去 30 日のリクエスト数・エラー率・レイテンシを確認可能</w:t>
+          <w:rStyle w:val="VerbatimChar"/>
+        </w:rPr>
+        <w:t xml:space="preserve">Wellfort Gemini API 月次予算</w:t>
       </w:r>
     </w:p>
     <w:p>
@@ -2062,7 +2368,19 @@
         <w:pStyle w:val="Compact"/>
       </w:pPr>
       <w:r>
-        <w:t xml:space="preserve">Google Cloud Console &gt;</w:t>
+        <w:t xml:space="preserve">対象: 本補助事業用プロジェクトを指定。</w:t>
+      </w:r>
+    </w:p>
+    <w:p>
+      <w:pPr>
+        <w:numPr>
+          <w:ilvl w:val="0"/>
+          <w:numId w:val="1014"/>
+        </w:numPr>
+        <w:pStyle w:val="Compact"/>
+      </w:pPr>
+      <w:r>
+        <w:t xml:space="preserve">予算額:</w:t>
       </w:r>
       <w:r>
         <w:t xml:space="preserve"> </w:t>
@@ -2072,6 +2390,144 @@
           <w:bCs/>
           <w:b/>
         </w:rPr>
+        <w:t xml:space="preserve">30,000 円 / 月</w:t>
+      </w:r>
+      <w:r>
+        <w:t xml:space="preserve"> </w:t>
+      </w:r>
+      <w:r>
+        <w:t xml:space="preserve">(推奨初期値・必要に応じて調整)</w:t>
+      </w:r>
+    </w:p>
+    <w:p>
+      <w:pPr>
+        <w:numPr>
+          <w:ilvl w:val="0"/>
+          <w:numId w:val="1014"/>
+        </w:numPr>
+        <w:pStyle w:val="Compact"/>
+      </w:pPr>
+      <w:r>
+        <w:t xml:space="preserve">アラートのしきい値:</w:t>
+      </w:r>
+      <w:r>
+        <w:t xml:space="preserve"> </w:t>
+      </w:r>
+      <w:r>
+        <w:rPr>
+          <w:bCs/>
+          <w:b/>
+        </w:rPr>
+        <w:t xml:space="preserve">50% / 90% / 100%</w:t>
+      </w:r>
+      <w:r>
+        <w:t xml:space="preserve"> </w:t>
+      </w:r>
+      <w:r>
+        <w:t xml:space="preserve">で通知する設定を有効化。</w:t>
+      </w:r>
+    </w:p>
+    <w:p>
+      <w:pPr>
+        <w:numPr>
+          <w:ilvl w:val="0"/>
+          <w:numId w:val="1014"/>
+        </w:numPr>
+        <w:pStyle w:val="Compact"/>
+      </w:pPr>
+      <w:r>
+        <w:t xml:space="preserve">通知先メールアドレス:</w:t>
+      </w:r>
+      <w:r>
+        <w:t xml:space="preserve"> </w:t>
+      </w:r>
+      <w:r>
+        <w:rPr>
+          <w:bCs/>
+          <w:b/>
+        </w:rPr>
+        <w:t xml:space="preserve">Wellfort 担当者 + UNFIX 担当者の双方</w:t>
+      </w:r>
+      <w:r>
+        <w:t xml:space="preserve"> </w:t>
+      </w:r>
+      <w:r>
+        <w:t xml:space="preserve">を登録。</w:t>
+      </w:r>
+    </w:p>
+    <w:p>
+      <w:r>
+        <w:pict>
+          <v:rect style="width:0;height:1.5pt" o:hralign="center" o:hrstd="t" o:hr="t"/>
+        </w:pict>
+      </w:r>
+    </w:p>
+    <w:bookmarkEnd w:id="38"/>
+    <w:bookmarkStart w:id="47" w:name="X162f4c9d316f2914f93a8ffe1187a770c8663ff"/>
+    <w:p>
+      <w:pPr>
+        <w:pStyle w:val="Heading2"/>
+      </w:pPr>
+      <w:r>
+        <w:t xml:space="preserve">6. 利用量の監視 (運用開始後)</w:t>
+      </w:r>
+    </w:p>
+    <w:bookmarkStart w:id="39" w:name="Xd1259937d747614382e2cf555247acbdbaadf41"/>
+    <w:p>
+      <w:pPr>
+        <w:pStyle w:val="Heading3"/>
+      </w:pPr>
+      <w:r>
+        <w:t xml:space="preserve">6.1 利用ダッシュボード</w:t>
+      </w:r>
+    </w:p>
+    <w:p>
+      <w:pPr>
+        <w:numPr>
+          <w:ilvl w:val="0"/>
+          <w:numId w:val="1016"/>
+        </w:numPr>
+        <w:pStyle w:val="Compact"/>
+      </w:pPr>
+      <w:r>
+        <w:t xml:space="preserve">Google Cloud Console &gt;</w:t>
+      </w:r>
+      <w:r>
+        <w:t xml:space="preserve"> </w:t>
+      </w:r>
+      <w:r>
+        <w:rPr>
+          <w:bCs/>
+          <w:b/>
+        </w:rPr>
+        <w:t xml:space="preserve">「API とサービス」 &gt; 「ダッシュボード」</w:t>
+      </w:r>
+      <w:r>
+        <w:t xml:space="preserve"> </w:t>
+      </w:r>
+      <w:r>
+        <w:t xml:space="preserve">→ 過去 30 日のリクエスト数・エラー率・レイテンシを確認可能</w:t>
+      </w:r>
+    </w:p>
+    <w:p>
+      <w:pPr>
+        <w:numPr>
+          <w:ilvl w:val="0"/>
+          <w:numId w:val="1016"/>
+        </w:numPr>
+        <w:pStyle w:val="Compact"/>
+      </w:pPr>
+      <w:r>
+        <w:t xml:space="preserve">Google Cloud Console &gt;</w:t>
+      </w:r>
+      <w:r>
+        <w:t xml:space="preserve"> </w:t>
+      </w:r>
+      <w:r>
+        <w:rPr>
+          <w:bCs/>
+          <w:b/>
+        </w:rPr>
         <w:t xml:space="preserve">「請求」 &gt; 「概要」</w:t>
       </w:r>
       <w:r>
@@ -2081,14 +2537,1847 @@
         <w:t xml:space="preserve">→ 当月の請求予測 / 過去月の請求実績を確認可能</w:t>
       </w:r>
     </w:p>
-    <w:bookmarkEnd w:id="35"/>
-    <w:bookmarkStart w:id="36" w:name="Xebbe836cabbb107971e751082d53c4e042b694b"/>
+    <w:bookmarkEnd w:id="39"/>
+    <w:bookmarkStart w:id="40" w:name="X24eee2a36a63cb35d381cbbab4fab100e4aa63f"/>
     <w:p>
       <w:pPr>
         <w:pStyle w:val="Heading3"/>
       </w:pPr>
       <w:r>
-        <w:t xml:space="preserve">6.2 想定利用量 (参考)</w:t>
+        <w:t xml:space="preserve">6.2 単価表 (2026 年 6 月時点・有料枠)</w:t>
+      </w:r>
+    </w:p>
+    <w:tbl>
+      <w:tblPr>
+        <w:tblStyle w:val="Table"/>
+        <w:tblW w:type="auto" w:w="0"/>
+        <w:tblLook w:firstRow="1" w:lastRow="0" w:firstColumn="0" w:lastColumn="0" w:noHBand="0" w:noVBand="0" w:val="0020"/>
+        <w:jc w:val="start"/>
+      </w:tblPr>
+      <w:tblGrid>
+        <w:gridCol w:w="1980"/>
+        <w:gridCol w:w="1980"/>
+        <w:gridCol w:w="1980"/>
+        <w:gridCol w:w="1980"/>
+      </w:tblGrid>
+      <w:tr>
+        <w:trPr>
+          <w:tblHeader w:val="true"/>
+        </w:trPr>
+        <w:tc>
+          <w:tcPr/>
+          <w:p>
+            <w:pPr>
+              <w:pStyle w:val="Compact"/>
+              <w:jc w:val="left"/>
+            </w:pPr>
+            <w:r>
+              <w:t xml:space="preserve">用途</w:t>
+            </w:r>
+          </w:p>
+        </w:tc>
+        <w:tc>
+          <w:tcPr/>
+          <w:p>
+            <w:pPr>
+              <w:pStyle w:val="Compact"/>
+              <w:jc w:val="left"/>
+            </w:pPr>
+            <w:r>
+              <w:t xml:space="preserve">モデル</w:t>
+            </w:r>
+          </w:p>
+        </w:tc>
+        <w:tc>
+          <w:tcPr/>
+          <w:p>
+            <w:pPr>
+              <w:pStyle w:val="Compact"/>
+              <w:jc w:val="right"/>
+            </w:pPr>
+            <w:r>
+              <w:t xml:space="preserve">入力単価</w:t>
+            </w:r>
+          </w:p>
+        </w:tc>
+        <w:tc>
+          <w:tcPr/>
+          <w:p>
+            <w:pPr>
+              <w:pStyle w:val="Compact"/>
+              <w:jc w:val="right"/>
+            </w:pPr>
+            <w:r>
+              <w:t xml:space="preserve">出力単価</w:t>
+            </w:r>
+          </w:p>
+        </w:tc>
+      </w:tr>
+      <w:tr>
+        <w:tc>
+          <w:tcPr/>
+          <w:p>
+            <w:pPr>
+              <w:pStyle w:val="Compact"/>
+              <w:jc w:val="left"/>
+            </w:pPr>
+            <w:r>
+              <w:rPr>
+                <w:bCs/>
+                <w:b/>
+              </w:rPr>
+              <w:t xml:space="preserve">AI スキャン</w:t>
+            </w:r>
+            <w:r>
+              <w:t xml:space="preserve"> </w:t>
+            </w:r>
+            <w:r>
+              <w:t xml:space="preserve">/</w:t>
+            </w:r>
+            <w:r>
+              <w:t xml:space="preserve"> </w:t>
+            </w:r>
+            <w:r>
+              <w:rPr>
+                <w:bCs/>
+                <w:b/>
+              </w:rPr>
+              <w:t xml:space="preserve">AI ヘルスコーチ</w:t>
+            </w:r>
+            <w:r>
+              <w:t xml:space="preserve"> </w:t>
+            </w:r>
+            <w:r>
+              <w:t xml:space="preserve">(テキスト・画像)</w:t>
+            </w:r>
+          </w:p>
+        </w:tc>
+        <w:tc>
+          <w:tcPr/>
+          <w:p>
+            <w:pPr>
+              <w:pStyle w:val="Compact"/>
+              <w:jc w:val="left"/>
+            </w:pPr>
+            <w:r>
+              <w:t xml:space="preserve">Gemini 2.5 Flash</w:t>
+            </w:r>
+          </w:p>
+        </w:tc>
+        <w:tc>
+          <w:tcPr/>
+          <w:p>
+            <w:pPr>
+              <w:pStyle w:val="Compact"/>
+              <w:jc w:val="right"/>
+            </w:pPr>
+            <w:r>
+              <w:t xml:space="preserve">**</w:t>
+            </w:r>
+            <m:oMath>
+              <m:r>
+                <m:t>0.30</m:t>
+              </m:r>
+              <m:r>
+                <m:rPr>
+                  <m:sty m:val="p"/>
+                </m:rPr>
+                <m:t>/</m:t>
+              </m:r>
+              <m:r>
+                <m:t>1</m:t>
+              </m:r>
+              <m:r>
+                <m:t>M</m:t>
+              </m:r>
+              <m:r>
+                <m:t>ト</m:t>
+              </m:r>
+              <m:r>
+                <m:t>ー</m:t>
+              </m:r>
+              <m:r>
+                <m:t>ク</m:t>
+              </m:r>
+              <m:r>
+                <m:t>ン</m:t>
+              </m:r>
+              <m:r>
+                <m:rPr>
+                  <m:sty m:val="p"/>
+                </m:rPr>
+                <m:t>*</m:t>
+              </m:r>
+              <m:r>
+                <m:rPr>
+                  <m:sty m:val="p"/>
+                </m:rPr>
+                <m:t>*</m:t>
+              </m:r>
+              <m:d>
+                <m:dPr>
+                  <m:begChr m:val="("/>
+                  <m:endChr m:val=")"/>
+                  <m:sepChr m:val=""/>
+                  <m:grow/>
+                </m:dPr>
+                <m:e>
+                  <m:r>
+                    <m:t>テ</m:t>
+                  </m:r>
+                  <m:r>
+                    <m:t>キ</m:t>
+                  </m:r>
+                  <m:r>
+                    <m:t>ス</m:t>
+                  </m:r>
+                  <m:r>
+                    <m:t>ト</m:t>
+                  </m:r>
+                  <m:r>
+                    <m:rPr>
+                      <m:sty m:val="p"/>
+                    </m:rPr>
+                    <m:t>・</m:t>
+                  </m:r>
+                  <m:r>
+                    <m:t>画</m:t>
+                  </m:r>
+                  <m:r>
+                    <m:t>像</m:t>
+                  </m:r>
+                  <m:r>
+                    <m:rPr>
+                      <m:sty m:val="p"/>
+                    </m:rPr>
+                    <m:t>・</m:t>
+                  </m:r>
+                  <m:r>
+                    <m:t>動</m:t>
+                  </m:r>
+                  <m:r>
+                    <m:t>画</m:t>
+                  </m:r>
+                </m:e>
+              </m:d>
+              <m:r>
+                <m:rPr>
+                  <m:sty m:val="p"/>
+                </m:rPr>
+                <m:t>&lt;</m:t>
+              </m:r>
+              <m:r>
+                <m:t>b</m:t>
+              </m:r>
+              <m:r>
+                <m:t>r</m:t>
+              </m:r>
+              <m:r>
+                <m:rPr>
+                  <m:sty m:val="p"/>
+                </m:rPr>
+                <m:t>&gt;</m:t>
+              </m:r>
+            </m:oMath>
+            <w:r>
+              <w:t xml:space="preserve">1.00 / 1M トークン (音声)</w:t>
+            </w:r>
+          </w:p>
+        </w:tc>
+        <w:tc>
+          <w:tcPr/>
+          <w:p>
+            <w:pPr>
+              <w:pStyle w:val="Compact"/>
+              <w:jc w:val="right"/>
+            </w:pPr>
+            <w:r>
+              <w:rPr>
+                <w:bCs/>
+                <w:b/>
+              </w:rPr>
+              <w:t xml:space="preserve">$2.50 / 1M トークン</w:t>
+            </w:r>
+          </w:p>
+        </w:tc>
+      </w:tr>
+      <w:tr>
+        <w:tc>
+          <w:tcPr/>
+          <w:p>
+            <w:pPr>
+              <w:pStyle w:val="Compact"/>
+              <w:jc w:val="left"/>
+            </w:pPr>
+            <w:r>
+              <w:rPr>
+                <w:bCs/>
+                <w:b/>
+              </w:rPr>
+              <w:t xml:space="preserve">AI 問診</w:t>
+            </w:r>
+            <w:r>
+              <w:t xml:space="preserve"> </w:t>
+            </w:r>
+            <w:r>
+              <w:t xml:space="preserve">(音声対話)</w:t>
+            </w:r>
+          </w:p>
+        </w:tc>
+        <w:tc>
+          <w:tcPr/>
+          <w:p>
+            <w:pPr>
+              <w:pStyle w:val="Compact"/>
+              <w:jc w:val="left"/>
+            </w:pPr>
+            <w:r>
+              <w:t xml:space="preserve">Gemini 3.1 Flash Live Preview</w:t>
+            </w:r>
+          </w:p>
+        </w:tc>
+        <w:tc>
+          <w:tcPr/>
+          <w:p>
+            <w:pPr>
+              <w:pStyle w:val="Compact"/>
+              <w:jc w:val="right"/>
+            </w:pPr>
+            <w:r>
+              <w:t xml:space="preserve">**</w:t>
+            </w:r>
+            <m:oMath>
+              <m:r>
+                <m:t>0.005</m:t>
+              </m:r>
+              <m:r>
+                <m:rPr>
+                  <m:sty m:val="p"/>
+                </m:rPr>
+                <m:t>/</m:t>
+              </m:r>
+              <m:r>
+                <m:t>分</m:t>
+              </m:r>
+              <m:r>
+                <m:rPr>
+                  <m:sty m:val="p"/>
+                </m:rPr>
+                <m:t>*</m:t>
+              </m:r>
+              <m:r>
+                <m:rPr>
+                  <m:sty m:val="p"/>
+                </m:rPr>
+                <m:t>*</m:t>
+              </m:r>
+              <m:d>
+                <m:dPr>
+                  <m:begChr m:val="("/>
+                  <m:endChr m:val=")"/>
+                  <m:sepChr m:val=""/>
+                  <m:grow/>
+                </m:dPr>
+                <m:e>
+                  <m:r>
+                    <m:t>音</m:t>
+                  </m:r>
+                  <m:r>
+                    <m:t>声</m:t>
+                  </m:r>
+                  <m:r>
+                    <m:t>入</m:t>
+                  </m:r>
+                  <m:r>
+                    <m:t>力</m:t>
+                  </m:r>
+                </m:e>
+              </m:d>
+              <m:r>
+                <m:rPr>
+                  <m:sty m:val="p"/>
+                </m:rPr>
+                <m:t>&lt;</m:t>
+              </m:r>
+              <m:r>
+                <m:t>b</m:t>
+              </m:r>
+              <m:r>
+                <m:t>r</m:t>
+              </m:r>
+              <m:r>
+                <m:rPr>
+                  <m:sty m:val="p"/>
+                </m:rPr>
+                <m:t>&gt;</m:t>
+              </m:r>
+            </m:oMath>
+            <w:r>
+              <w:t xml:space="preserve">3.00 / 1M トークン</w:t>
+            </w:r>
+          </w:p>
+        </w:tc>
+        <w:tc>
+          <w:tcPr/>
+          <w:p>
+            <w:pPr>
+              <w:pStyle w:val="Compact"/>
+              <w:jc w:val="right"/>
+            </w:pPr>
+            <w:r>
+              <w:t xml:space="preserve">**</w:t>
+            </w:r>
+            <m:oMath>
+              <m:r>
+                <m:t>0.018</m:t>
+              </m:r>
+              <m:r>
+                <m:rPr>
+                  <m:sty m:val="p"/>
+                </m:rPr>
+                <m:t>/</m:t>
+              </m:r>
+              <m:r>
+                <m:t>分</m:t>
+              </m:r>
+              <m:r>
+                <m:rPr>
+                  <m:sty m:val="p"/>
+                </m:rPr>
+                <m:t>*</m:t>
+              </m:r>
+              <m:r>
+                <m:rPr>
+                  <m:sty m:val="p"/>
+                </m:rPr>
+                <m:t>*</m:t>
+              </m:r>
+              <m:d>
+                <m:dPr>
+                  <m:begChr m:val="("/>
+                  <m:endChr m:val=")"/>
+                  <m:sepChr m:val=""/>
+                  <m:grow/>
+                </m:dPr>
+                <m:e>
+                  <m:r>
+                    <m:t>音</m:t>
+                  </m:r>
+                  <m:r>
+                    <m:t>声</m:t>
+                  </m:r>
+                  <m:r>
+                    <m:t>出</m:t>
+                  </m:r>
+                  <m:r>
+                    <m:t>力</m:t>
+                  </m:r>
+                </m:e>
+              </m:d>
+              <m:r>
+                <m:rPr>
+                  <m:sty m:val="p"/>
+                </m:rPr>
+                <m:t>&lt;</m:t>
+              </m:r>
+              <m:r>
+                <m:t>b</m:t>
+              </m:r>
+              <m:r>
+                <m:t>r</m:t>
+              </m:r>
+              <m:r>
+                <m:rPr>
+                  <m:sty m:val="p"/>
+                </m:rPr>
+                <m:t>&gt;</m:t>
+              </m:r>
+            </m:oMath>
+            <w:r>
+              <w:t xml:space="preserve">12.00 / 1M トークン</w:t>
+            </w:r>
+          </w:p>
+        </w:tc>
+      </w:tr>
+    </w:tbl>
+    <w:p>
+      <w:pPr>
+        <w:pStyle w:val="BodyText"/>
+      </w:pPr>
+      <w:r>
+        <w:t xml:space="preserve">(1 ドル = 約 150 円換算)</w:t>
+      </w:r>
+    </w:p>
+    <w:bookmarkEnd w:id="40"/>
+    <w:bookmarkStart w:id="44" w:name="X65b5c400dd3cd4f960b355737ab042d8c5822cb"/>
+    <w:p>
+      <w:pPr>
+        <w:pStyle w:val="Heading3"/>
+      </w:pPr>
+      <w:r>
+        <w:t xml:space="preserve">6.3 機能別の 1 回あたり費用試算</w:t>
+      </w:r>
+    </w:p>
+    <w:bookmarkStart w:id="41" w:name="Xcb176860a3a52ff427d64f5f13871f2b8366c95"/>
+    <w:p>
+      <w:pPr>
+        <w:pStyle w:val="Heading4"/>
+      </w:pPr>
+      <w:r>
+        <w:t xml:space="preserve">6.3.1 AI スキャン (検査票 1 枚あたり)</w:t>
+      </w:r>
+    </w:p>
+    <w:p>
+      <w:pPr>
+        <w:pStyle w:val="FirstParagraph"/>
+      </w:pPr>
+      <w:r>
+        <w:t xml:space="preserve">ネイティブ・マルチモーダル AI による画像 → 構造化抽出。1 枚の検査票画像 (A4 1 ページ相当) を投入する想定。</w:t>
+      </w:r>
+    </w:p>
+    <w:tbl>
+      <w:tblPr>
+        <w:tblStyle w:val="Table"/>
+        <w:tblW w:type="auto" w:w="0"/>
+        <w:tblLook w:firstRow="1" w:lastRow="0" w:firstColumn="0" w:lastColumn="0" w:noHBand="0" w:noVBand="0" w:val="0020"/>
+        <w:jc w:val="start"/>
+      </w:tblPr>
+      <w:tblGrid>
+        <w:gridCol w:w="1980"/>
+        <w:gridCol w:w="1980"/>
+        <w:gridCol w:w="1980"/>
+        <w:gridCol w:w="1980"/>
+      </w:tblGrid>
+      <w:tr>
+        <w:trPr>
+          <w:tblHeader w:val="true"/>
+        </w:trPr>
+        <w:tc>
+          <w:tcPr/>
+          <w:p>
+            <w:pPr>
+              <w:pStyle w:val="Compact"/>
+              <w:jc w:val="left"/>
+            </w:pPr>
+            <w:r>
+              <w:t xml:space="preserve">項目</w:t>
+            </w:r>
+          </w:p>
+        </w:tc>
+        <w:tc>
+          <w:tcPr/>
+          <w:p>
+            <w:pPr>
+              <w:pStyle w:val="Compact"/>
+              <w:jc w:val="right"/>
+            </w:pPr>
+            <w:r>
+              <w:t xml:space="preserve">量</w:t>
+            </w:r>
+          </w:p>
+        </w:tc>
+        <w:tc>
+          <w:tcPr/>
+          <w:p>
+            <w:pPr>
+              <w:pStyle w:val="Compact"/>
+              <w:jc w:val="left"/>
+            </w:pPr>
+            <w:r>
+              <w:t xml:space="preserve">計算</w:t>
+            </w:r>
+          </w:p>
+        </w:tc>
+        <w:tc>
+          <w:tcPr/>
+          <w:p>
+            <w:pPr>
+              <w:pStyle w:val="Compact"/>
+              <w:jc w:val="right"/>
+            </w:pPr>
+            <w:r>
+              <w:t xml:space="preserve">金額</w:t>
+            </w:r>
+          </w:p>
+        </w:tc>
+      </w:tr>
+      <w:tr>
+        <w:tc>
+          <w:tcPr/>
+          <w:p>
+            <w:pPr>
+              <w:pStyle w:val="Compact"/>
+              <w:jc w:val="left"/>
+            </w:pPr>
+            <w:r>
+              <w:t xml:space="preserve">入力 (画像: 1,500 トークン + プロンプト: 500 トークン)</w:t>
+            </w:r>
+          </w:p>
+        </w:tc>
+        <w:tc>
+          <w:tcPr/>
+          <w:p>
+            <w:pPr>
+              <w:pStyle w:val="Compact"/>
+              <w:jc w:val="right"/>
+            </w:pPr>
+            <w:r>
+              <w:t xml:space="preserve">2,000 tokens</w:t>
+            </w:r>
+          </w:p>
+        </w:tc>
+        <w:tc>
+          <w:tcPr/>
+          <w:p>
+            <w:pPr>
+              <w:pStyle w:val="Compact"/>
+              <w:jc w:val="left"/>
+            </w:pPr>
+            <w:r>
+              <w:t xml:space="preserve">2,000 / 1M × $0.30</w:t>
+            </w:r>
+          </w:p>
+        </w:tc>
+        <w:tc>
+          <w:tcPr/>
+          <w:p>
+            <w:pPr>
+              <w:pStyle w:val="Compact"/>
+              <w:jc w:val="right"/>
+            </w:pPr>
+            <w:r>
+              <w:t xml:space="preserve">$0.0006</w:t>
+            </w:r>
+          </w:p>
+        </w:tc>
+      </w:tr>
+      <w:tr>
+        <w:tc>
+          <w:tcPr/>
+          <w:p>
+            <w:pPr>
+              <w:pStyle w:val="Compact"/>
+              <w:jc w:val="left"/>
+            </w:pPr>
+            <w:r>
+              <w:t xml:space="preserve">出力 (構造化 Markdown 約 2,500 トークン)</w:t>
+            </w:r>
+          </w:p>
+        </w:tc>
+        <w:tc>
+          <w:tcPr/>
+          <w:p>
+            <w:pPr>
+              <w:pStyle w:val="Compact"/>
+              <w:jc w:val="right"/>
+            </w:pPr>
+            <w:r>
+              <w:t xml:space="preserve">2,500 tokens</w:t>
+            </w:r>
+          </w:p>
+        </w:tc>
+        <w:tc>
+          <w:tcPr/>
+          <w:p>
+            <w:pPr>
+              <w:pStyle w:val="Compact"/>
+              <w:jc w:val="left"/>
+            </w:pPr>
+            <w:r>
+              <w:t xml:space="preserve">2,500 / 1M × $2.50</w:t>
+            </w:r>
+          </w:p>
+        </w:tc>
+        <w:tc>
+          <w:tcPr/>
+          <w:p>
+            <w:pPr>
+              <w:pStyle w:val="Compact"/>
+              <w:jc w:val="right"/>
+            </w:pPr>
+            <w:r>
+              <w:t xml:space="preserve">$0.00625</w:t>
+            </w:r>
+          </w:p>
+        </w:tc>
+      </w:tr>
+      <w:tr>
+        <w:tc>
+          <w:tcPr/>
+          <w:p>
+            <w:pPr>
+              <w:pStyle w:val="Compact"/>
+              <w:jc w:val="left"/>
+            </w:pPr>
+            <w:r>
+              <w:rPr>
+                <w:bCs/>
+                <w:b/>
+              </w:rPr>
+              <w:t xml:space="preserve">小計</w:t>
+            </w:r>
+          </w:p>
+        </w:tc>
+        <w:tc>
+          <w:tcPr/>
+          <w:p>
+            <w:pPr>
+              <w:pStyle w:val="Compact"/>
+            </w:pPr>
+          </w:p>
+        </w:tc>
+        <w:tc>
+          <w:tcPr/>
+          <w:p>
+            <w:pPr>
+              <w:pStyle w:val="Compact"/>
+            </w:pPr>
+          </w:p>
+        </w:tc>
+        <w:tc>
+          <w:tcPr/>
+          <w:p>
+            <w:pPr>
+              <w:pStyle w:val="Compact"/>
+              <w:jc w:val="right"/>
+            </w:pPr>
+            <w:r>
+              <w:rPr>
+                <w:bCs/>
+                <w:b/>
+              </w:rPr>
+              <w:t xml:space="preserve">$0.00685 ≒ 約 1 円</w:t>
+            </w:r>
+          </w:p>
+        </w:tc>
+      </w:tr>
+    </w:tbl>
+    <w:p>
+      <w:pPr>
+        <w:pStyle w:val="BodyText"/>
+      </w:pPr>
+      <w:r>
+        <w:rPr>
+          <w:bCs/>
+          <w:b/>
+        </w:rPr>
+        <w:t xml:space="preserve">ユーザー 1 名あたりの想定</w:t>
+      </w:r>
+      <w:r>
+        <w:t xml:space="preserve">: 4 検査種別 × 平均 2 ページ = 8 ページ →</w:t>
+      </w:r>
+      <w:r>
+        <w:t xml:space="preserve"> </w:t>
+      </w:r>
+      <w:r>
+        <w:rPr>
+          <w:bCs/>
+          <w:b/>
+        </w:rPr>
+        <w:t xml:space="preserve">約 8 円 / ユーザー</w:t>
+      </w:r>
+    </w:p>
+    <w:bookmarkEnd w:id="41"/>
+    <w:bookmarkStart w:id="42" w:name="X4a40b381151f6b6dc9a9a419703d6c3617d3eaf"/>
+    <w:p>
+      <w:pPr>
+        <w:pStyle w:val="Heading4"/>
+      </w:pPr>
+      <w:r>
+        <w:t xml:space="preserve">6.3.2 AI 問診 (1 セッションあたり)</w:t>
+      </w:r>
+    </w:p>
+    <w:p>
+      <w:pPr>
+        <w:pStyle w:val="FirstParagraph"/>
+      </w:pPr>
+      <w:r>
+        <w:t xml:space="preserve">5 セクション・17 質問の音声対話。1 セッション平均 4〜5 分を想定。</w:t>
+      </w:r>
+    </w:p>
+    <w:tbl>
+      <w:tblPr>
+        <w:tblStyle w:val="Table"/>
+        <w:tblW w:type="auto" w:w="0"/>
+        <w:tblLook w:firstRow="1" w:lastRow="0" w:firstColumn="0" w:lastColumn="0" w:noHBand="0" w:noVBand="0" w:val="0020"/>
+        <w:jc w:val="start"/>
+      </w:tblPr>
+      <w:tblGrid>
+        <w:gridCol w:w="1980"/>
+        <w:gridCol w:w="1980"/>
+        <w:gridCol w:w="1980"/>
+        <w:gridCol w:w="1980"/>
+      </w:tblGrid>
+      <w:tr>
+        <w:trPr>
+          <w:tblHeader w:val="true"/>
+        </w:trPr>
+        <w:tc>
+          <w:tcPr/>
+          <w:p>
+            <w:pPr>
+              <w:pStyle w:val="Compact"/>
+              <w:jc w:val="left"/>
+            </w:pPr>
+            <w:r>
+              <w:t xml:space="preserve">項目</w:t>
+            </w:r>
+          </w:p>
+        </w:tc>
+        <w:tc>
+          <w:tcPr/>
+          <w:p>
+            <w:pPr>
+              <w:pStyle w:val="Compact"/>
+              <w:jc w:val="right"/>
+            </w:pPr>
+            <w:r>
+              <w:t xml:space="preserve">量</w:t>
+            </w:r>
+          </w:p>
+        </w:tc>
+        <w:tc>
+          <w:tcPr/>
+          <w:p>
+            <w:pPr>
+              <w:pStyle w:val="Compact"/>
+              <w:jc w:val="left"/>
+            </w:pPr>
+            <w:r>
+              <w:t xml:space="preserve">計算</w:t>
+            </w:r>
+          </w:p>
+        </w:tc>
+        <w:tc>
+          <w:tcPr/>
+          <w:p>
+            <w:pPr>
+              <w:pStyle w:val="Compact"/>
+              <w:jc w:val="right"/>
+            </w:pPr>
+            <w:r>
+              <w:t xml:space="preserve">金額</w:t>
+            </w:r>
+          </w:p>
+        </w:tc>
+      </w:tr>
+      <w:tr>
+        <w:tc>
+          <w:tcPr/>
+          <w:p>
+            <w:pPr>
+              <w:pStyle w:val="Compact"/>
+              <w:jc w:val="left"/>
+            </w:pPr>
+            <w:r>
+              <w:t xml:space="preserve">入力音声 (ユーザー発話 4 分)</w:t>
+            </w:r>
+          </w:p>
+        </w:tc>
+        <w:tc>
+          <w:tcPr/>
+          <w:p>
+            <w:pPr>
+              <w:pStyle w:val="Compact"/>
+              <w:jc w:val="right"/>
+            </w:pPr>
+            <w:r>
+              <w:t xml:space="preserve">4 分</w:t>
+            </w:r>
+          </w:p>
+        </w:tc>
+        <w:tc>
+          <w:tcPr/>
+          <w:p>
+            <w:pPr>
+              <w:pStyle w:val="Compact"/>
+              <w:jc w:val="left"/>
+            </w:pPr>
+            <w:r>
+              <w:t xml:space="preserve">4 × $0.005</w:t>
+            </w:r>
+          </w:p>
+        </w:tc>
+        <w:tc>
+          <w:tcPr/>
+          <w:p>
+            <w:pPr>
+              <w:pStyle w:val="Compact"/>
+              <w:jc w:val="right"/>
+            </w:pPr>
+            <w:r>
+              <w:t xml:space="preserve">$0.020</w:t>
+            </w:r>
+          </w:p>
+        </w:tc>
+      </w:tr>
+      <w:tr>
+        <w:tc>
+          <w:tcPr/>
+          <w:p>
+            <w:pPr>
+              <w:pStyle w:val="Compact"/>
+              <w:jc w:val="left"/>
+            </w:pPr>
+            <w:r>
+              <w:t xml:space="preserve">出力音声 (AI 発話 4 分)</w:t>
+            </w:r>
+          </w:p>
+        </w:tc>
+        <w:tc>
+          <w:tcPr/>
+          <w:p>
+            <w:pPr>
+              <w:pStyle w:val="Compact"/>
+              <w:jc w:val="right"/>
+            </w:pPr>
+            <w:r>
+              <w:t xml:space="preserve">4 分</w:t>
+            </w:r>
+          </w:p>
+        </w:tc>
+        <w:tc>
+          <w:tcPr/>
+          <w:p>
+            <w:pPr>
+              <w:pStyle w:val="Compact"/>
+              <w:jc w:val="left"/>
+            </w:pPr>
+            <w:r>
+              <w:t xml:space="preserve">4 × $0.018</w:t>
+            </w:r>
+          </w:p>
+        </w:tc>
+        <w:tc>
+          <w:tcPr/>
+          <w:p>
+            <w:pPr>
+              <w:pStyle w:val="Compact"/>
+              <w:jc w:val="right"/>
+            </w:pPr>
+            <w:r>
+              <w:t xml:space="preserve">$0.072</w:t>
+            </w:r>
+          </w:p>
+        </w:tc>
+      </w:tr>
+      <w:tr>
+        <w:tc>
+          <w:tcPr/>
+          <w:p>
+            <w:pPr>
+              <w:pStyle w:val="Compact"/>
+              <w:jc w:val="left"/>
+            </w:pPr>
+            <w:r>
+              <w:rPr>
+                <w:bCs/>
+                <w:b/>
+              </w:rPr>
+              <w:t xml:space="preserve">小計</w:t>
+            </w:r>
+          </w:p>
+        </w:tc>
+        <w:tc>
+          <w:tcPr/>
+          <w:p>
+            <w:pPr>
+              <w:pStyle w:val="Compact"/>
+            </w:pPr>
+          </w:p>
+        </w:tc>
+        <w:tc>
+          <w:tcPr/>
+          <w:p>
+            <w:pPr>
+              <w:pStyle w:val="Compact"/>
+            </w:pPr>
+          </w:p>
+        </w:tc>
+        <w:tc>
+          <w:tcPr/>
+          <w:p>
+            <w:pPr>
+              <w:pStyle w:val="Compact"/>
+              <w:jc w:val="right"/>
+            </w:pPr>
+            <w:r>
+              <w:rPr>
+                <w:bCs/>
+                <w:b/>
+              </w:rPr>
+              <w:t xml:space="preserve">$0.092 ≒ 約 14 円</w:t>
+            </w:r>
+          </w:p>
+        </w:tc>
+      </w:tr>
+    </w:tbl>
+    <w:p>
+      <w:pPr>
+        <w:pStyle w:val="BodyText"/>
+      </w:pPr>
+      <w:r>
+        <w:rPr>
+          <w:bCs/>
+          <w:b/>
+        </w:rPr>
+        <w:t xml:space="preserve">ユーザー 1 名あたりの想定</w:t>
+      </w:r>
+      <w:r>
+        <w:t xml:space="preserve">: AI 問診は年 1〜2 回実施 →</w:t>
+      </w:r>
+      <w:r>
+        <w:t xml:space="preserve"> </w:t>
+      </w:r>
+      <w:r>
+        <w:rPr>
+          <w:bCs/>
+          <w:b/>
+        </w:rPr>
+        <w:t xml:space="preserve">約 14〜28 円 / ユーザー / 年</w:t>
+      </w:r>
+    </w:p>
+    <w:bookmarkEnd w:id="42"/>
+    <w:bookmarkStart w:id="43" w:name="X75983849051e7f4312733118e7dccea191464f4"/>
+    <w:p>
+      <w:pPr>
+        <w:pStyle w:val="Heading4"/>
+      </w:pPr>
+      <w:r>
+        <w:t xml:space="preserve">6.3.3 AI ヘルスコーチ (1 質問あたり)</w:t>
+      </w:r>
+    </w:p>
+    <w:p>
+      <w:pPr>
+        <w:pStyle w:val="FirstParagraph"/>
+      </w:pPr>
+      <w:r>
+        <w:t xml:space="preserve">検査結果 (Elith JSON 全 10 セクション) を毎回 context として渡す方式のため、入力トークンが大きい。</w:t>
+      </w:r>
+    </w:p>
+    <w:tbl>
+      <w:tblPr>
+        <w:tblStyle w:val="Table"/>
+        <w:tblW w:type="auto" w:w="0"/>
+        <w:tblLook w:firstRow="1" w:lastRow="0" w:firstColumn="0" w:lastColumn="0" w:noHBand="0" w:noVBand="0" w:val="0020"/>
+        <w:jc w:val="start"/>
+      </w:tblPr>
+      <w:tblGrid>
+        <w:gridCol w:w="1980"/>
+        <w:gridCol w:w="1980"/>
+        <w:gridCol w:w="1980"/>
+        <w:gridCol w:w="1980"/>
+      </w:tblGrid>
+      <w:tr>
+        <w:trPr>
+          <w:tblHeader w:val="true"/>
+        </w:trPr>
+        <w:tc>
+          <w:tcPr/>
+          <w:p>
+            <w:pPr>
+              <w:pStyle w:val="Compact"/>
+              <w:jc w:val="left"/>
+            </w:pPr>
+            <w:r>
+              <w:t xml:space="preserve">項目</w:t>
+            </w:r>
+          </w:p>
+        </w:tc>
+        <w:tc>
+          <w:tcPr/>
+          <w:p>
+            <w:pPr>
+              <w:pStyle w:val="Compact"/>
+              <w:jc w:val="right"/>
+            </w:pPr>
+            <w:r>
+              <w:t xml:space="preserve">量</w:t>
+            </w:r>
+          </w:p>
+        </w:tc>
+        <w:tc>
+          <w:tcPr/>
+          <w:p>
+            <w:pPr>
+              <w:pStyle w:val="Compact"/>
+              <w:jc w:val="left"/>
+            </w:pPr>
+            <w:r>
+              <w:t xml:space="preserve">計算</w:t>
+            </w:r>
+          </w:p>
+        </w:tc>
+        <w:tc>
+          <w:tcPr/>
+          <w:p>
+            <w:pPr>
+              <w:pStyle w:val="Compact"/>
+              <w:jc w:val="right"/>
+            </w:pPr>
+            <w:r>
+              <w:t xml:space="preserve">金額</w:t>
+            </w:r>
+          </w:p>
+        </w:tc>
+      </w:tr>
+      <w:tr>
+        <w:tc>
+          <w:tcPr/>
+          <w:p>
+            <w:pPr>
+              <w:pStyle w:val="Compact"/>
+              <w:jc w:val="left"/>
+            </w:pPr>
+            <w:r>
+              <w:t xml:space="preserve">入力 (Elith JSON context 約 28,000 + 履歴 1,500 + 質問 500)</w:t>
+            </w:r>
+          </w:p>
+        </w:tc>
+        <w:tc>
+          <w:tcPr/>
+          <w:p>
+            <w:pPr>
+              <w:pStyle w:val="Compact"/>
+              <w:jc w:val="right"/>
+            </w:pPr>
+            <w:r>
+              <w:t xml:space="preserve">30,000 tokens</w:t>
+            </w:r>
+          </w:p>
+        </w:tc>
+        <w:tc>
+          <w:tcPr/>
+          <w:p>
+            <w:pPr>
+              <w:pStyle w:val="Compact"/>
+              <w:jc w:val="left"/>
+            </w:pPr>
+            <w:r>
+              <w:t xml:space="preserve">30,000 / 1M × $0.30</w:t>
+            </w:r>
+          </w:p>
+        </w:tc>
+        <w:tc>
+          <w:tcPr/>
+          <w:p>
+            <w:pPr>
+              <w:pStyle w:val="Compact"/>
+              <w:jc w:val="right"/>
+            </w:pPr>
+            <w:r>
+              <w:t xml:space="preserve">$0.009</w:t>
+            </w:r>
+          </w:p>
+        </w:tc>
+      </w:tr>
+      <w:tr>
+        <w:tc>
+          <w:tcPr/>
+          <w:p>
+            <w:pPr>
+              <w:pStyle w:val="Compact"/>
+              <w:jc w:val="left"/>
+            </w:pPr>
+            <w:r>
+              <w:t xml:space="preserve">出力 (AI 回答 約 500 トークン)</w:t>
+            </w:r>
+          </w:p>
+        </w:tc>
+        <w:tc>
+          <w:tcPr/>
+          <w:p>
+            <w:pPr>
+              <w:pStyle w:val="Compact"/>
+              <w:jc w:val="right"/>
+            </w:pPr>
+            <w:r>
+              <w:t xml:space="preserve">500 tokens</w:t>
+            </w:r>
+          </w:p>
+        </w:tc>
+        <w:tc>
+          <w:tcPr/>
+          <w:p>
+            <w:pPr>
+              <w:pStyle w:val="Compact"/>
+              <w:jc w:val="left"/>
+            </w:pPr>
+            <w:r>
+              <w:t xml:space="preserve">500 / 1M × $2.50</w:t>
+            </w:r>
+          </w:p>
+        </w:tc>
+        <w:tc>
+          <w:tcPr/>
+          <w:p>
+            <w:pPr>
+              <w:pStyle w:val="Compact"/>
+              <w:jc w:val="right"/>
+            </w:pPr>
+            <w:r>
+              <w:t xml:space="preserve">$0.00125</w:t>
+            </w:r>
+          </w:p>
+        </w:tc>
+      </w:tr>
+      <w:tr>
+        <w:tc>
+          <w:tcPr/>
+          <w:p>
+            <w:pPr>
+              <w:pStyle w:val="Compact"/>
+              <w:jc w:val="left"/>
+            </w:pPr>
+            <w:r>
+              <w:rPr>
+                <w:bCs/>
+                <w:b/>
+              </w:rPr>
+              <w:t xml:space="preserve">小計</w:t>
+            </w:r>
+          </w:p>
+        </w:tc>
+        <w:tc>
+          <w:tcPr/>
+          <w:p>
+            <w:pPr>
+              <w:pStyle w:val="Compact"/>
+            </w:pPr>
+          </w:p>
+        </w:tc>
+        <w:tc>
+          <w:tcPr/>
+          <w:p>
+            <w:pPr>
+              <w:pStyle w:val="Compact"/>
+            </w:pPr>
+          </w:p>
+        </w:tc>
+        <w:tc>
+          <w:tcPr/>
+          <w:p>
+            <w:pPr>
+              <w:pStyle w:val="Compact"/>
+              <w:jc w:val="right"/>
+            </w:pPr>
+            <w:r>
+              <w:rPr>
+                <w:bCs/>
+                <w:b/>
+              </w:rPr>
+              <w:t xml:space="preserve">$0.01025 ≒ 約 1.5 円</w:t>
+            </w:r>
+          </w:p>
+        </w:tc>
+      </w:tr>
+    </w:tbl>
+    <w:p>
+      <w:pPr>
+        <w:pStyle w:val="BodyText"/>
+      </w:pPr>
+      <w:r>
+        <w:rPr>
+          <w:bCs/>
+          <w:b/>
+        </w:rPr>
+        <w:t xml:space="preserve">ユーザー 1 名あたりの想定</w:t>
+      </w:r>
+      <w:r>
+        <w:t xml:space="preserve">: 月平均 5 質問 →</w:t>
+      </w:r>
+      <w:r>
+        <w:t xml:space="preserve"> </w:t>
+      </w:r>
+      <w:r>
+        <w:rPr>
+          <w:bCs/>
+          <w:b/>
+        </w:rPr>
+        <w:t xml:space="preserve">約 8 円 / ユーザー / 月</w:t>
+      </w:r>
+    </w:p>
+    <w:bookmarkEnd w:id="43"/>
+    <w:bookmarkEnd w:id="44"/>
+    <w:bookmarkStart w:id="45" w:name="Xb18f3246bd8ca9982a115cd761f223a41f1243a"/>
+    <w:p>
+      <w:pPr>
+        <w:pStyle w:val="Heading3"/>
+      </w:pPr>
+      <w:r>
+        <w:t xml:space="preserve">6.4 月間ユーザー規模別 費用シナリオ</w:t>
+      </w:r>
+    </w:p>
+    <w:tbl>
+      <w:tblPr>
+        <w:tblStyle w:val="Table"/>
+        <w:tblW w:type="auto" w:w="0"/>
+        <w:tblLook w:firstRow="1" w:lastRow="0" w:firstColumn="0" w:lastColumn="0" w:noHBand="0" w:noVBand="0" w:val="0020"/>
+        <w:jc w:val="start"/>
+      </w:tblPr>
+      <w:tblGrid>
+        <w:gridCol w:w="1320"/>
+        <w:gridCol w:w="1320"/>
+        <w:gridCol w:w="1320"/>
+        <w:gridCol w:w="1320"/>
+        <w:gridCol w:w="1320"/>
+        <w:gridCol w:w="1320"/>
+      </w:tblGrid>
+      <w:tr>
+        <w:trPr>
+          <w:tblHeader w:val="true"/>
+        </w:trPr>
+        <w:tc>
+          <w:tcPr/>
+          <w:p>
+            <w:pPr>
+              <w:pStyle w:val="Compact"/>
+              <w:jc w:val="left"/>
+            </w:pPr>
+            <w:r>
+              <w:t xml:space="preserve">規模</w:t>
+            </w:r>
+          </w:p>
+        </w:tc>
+        <w:tc>
+          <w:tcPr/>
+          <w:p>
+            <w:pPr>
+              <w:pStyle w:val="Compact"/>
+              <w:jc w:val="right"/>
+            </w:pPr>
+            <w:r>
+              <w:t xml:space="preserve">想定アクティブユーザー数 / 月</w:t>
+            </w:r>
+          </w:p>
+        </w:tc>
+        <w:tc>
+          <w:tcPr/>
+          <w:p>
+            <w:pPr>
+              <w:pStyle w:val="Compact"/>
+              <w:jc w:val="right"/>
+            </w:pPr>
+            <w:r>
+              <w:t xml:space="preserve">AI スキャン</w:t>
+            </w:r>
+            <w:r>
+              <w:t xml:space="preserve">(年 1 回想定)</w:t>
+            </w:r>
+          </w:p>
+        </w:tc>
+        <w:tc>
+          <w:tcPr/>
+          <w:p>
+            <w:pPr>
+              <w:pStyle w:val="Compact"/>
+              <w:jc w:val="right"/>
+            </w:pPr>
+            <w:r>
+              <w:t xml:space="preserve">AI 問診</w:t>
+            </w:r>
+            <w:r>
+              <w:t xml:space="preserve">(年 1 回想定)</w:t>
+            </w:r>
+          </w:p>
+        </w:tc>
+        <w:tc>
+          <w:tcPr/>
+          <w:p>
+            <w:pPr>
+              <w:pStyle w:val="Compact"/>
+              <w:jc w:val="right"/>
+            </w:pPr>
+            <w:r>
+              <w:t xml:space="preserve">AI ヘルスコーチ</w:t>
+            </w:r>
+            <w:r>
+              <w:t xml:space="preserve">(月 5 質問)</w:t>
+            </w:r>
+          </w:p>
+        </w:tc>
+        <w:tc>
+          <w:tcPr/>
+          <w:p>
+            <w:pPr>
+              <w:pStyle w:val="Compact"/>
+              <w:jc w:val="right"/>
+            </w:pPr>
+            <w:r>
+              <w:rPr>
+                <w:bCs/>
+                <w:b/>
+              </w:rPr>
+              <w:t xml:space="preserve">月合計 (税抜)</w:t>
+            </w:r>
+          </w:p>
+        </w:tc>
+      </w:tr>
+      <w:tr>
+        <w:tc>
+          <w:tcPr/>
+          <w:p>
+            <w:pPr>
+              <w:pStyle w:val="Compact"/>
+              <w:jc w:val="left"/>
+            </w:pPr>
+            <w:r>
+              <w:t xml:space="preserve">パイロット期</w:t>
+            </w:r>
+          </w:p>
+        </w:tc>
+        <w:tc>
+          <w:tcPr/>
+          <w:p>
+            <w:pPr>
+              <w:pStyle w:val="Compact"/>
+              <w:jc w:val="right"/>
+            </w:pPr>
+            <w:r>
+              <w:t xml:space="preserve">100</w:t>
+            </w:r>
+          </w:p>
+        </w:tc>
+        <w:tc>
+          <w:tcPr/>
+          <w:p>
+            <w:pPr>
+              <w:pStyle w:val="Compact"/>
+              <w:jc w:val="right"/>
+            </w:pPr>
+            <w:r>
+              <w:t xml:space="preserve">約 70 円</w:t>
+            </w:r>
+            <w:r>
+              <w:t xml:space="preserve">(1/12 で月按分)</w:t>
+            </w:r>
+          </w:p>
+        </w:tc>
+        <w:tc>
+          <w:tcPr/>
+          <w:p>
+            <w:pPr>
+              <w:pStyle w:val="Compact"/>
+              <w:jc w:val="right"/>
+            </w:pPr>
+            <w:r>
+              <w:t xml:space="preserve">約 120 円</w:t>
+            </w:r>
+            <w:r>
+              <w:t xml:space="preserve">(1/12 で月按分)</w:t>
+            </w:r>
+          </w:p>
+        </w:tc>
+        <w:tc>
+          <w:tcPr/>
+          <w:p>
+            <w:pPr>
+              <w:pStyle w:val="Compact"/>
+              <w:jc w:val="right"/>
+            </w:pPr>
+            <w:r>
+              <w:t xml:space="preserve">約 800 円</w:t>
+            </w:r>
+          </w:p>
+        </w:tc>
+        <w:tc>
+          <w:tcPr/>
+          <w:p>
+            <w:pPr>
+              <w:pStyle w:val="Compact"/>
+              <w:jc w:val="right"/>
+            </w:pPr>
+            <w:r>
+              <w:rPr>
+                <w:bCs/>
+                <w:b/>
+              </w:rPr>
+              <w:t xml:space="preserve">約 1,000 円</w:t>
+            </w:r>
+          </w:p>
+        </w:tc>
+      </w:tr>
+      <w:tr>
+        <w:tc>
+          <w:tcPr/>
+          <w:p>
+            <w:pPr>
+              <w:pStyle w:val="Compact"/>
+              <w:jc w:val="left"/>
+            </w:pPr>
+            <w:r>
+              <w:t xml:space="preserve">初期運用</w:t>
+            </w:r>
+          </w:p>
+        </w:tc>
+        <w:tc>
+          <w:tcPr/>
+          <w:p>
+            <w:pPr>
+              <w:pStyle w:val="Compact"/>
+              <w:jc w:val="right"/>
+            </w:pPr>
+            <w:r>
+              <w:t xml:space="preserve">500</w:t>
+            </w:r>
+          </w:p>
+        </w:tc>
+        <w:tc>
+          <w:tcPr/>
+          <w:p>
+            <w:pPr>
+              <w:pStyle w:val="Compact"/>
+              <w:jc w:val="right"/>
+            </w:pPr>
+            <w:r>
+              <w:t xml:space="preserve">約 350 円</w:t>
+            </w:r>
+          </w:p>
+        </w:tc>
+        <w:tc>
+          <w:tcPr/>
+          <w:p>
+            <w:pPr>
+              <w:pStyle w:val="Compact"/>
+              <w:jc w:val="right"/>
+            </w:pPr>
+            <w:r>
+              <w:t xml:space="preserve">約 580 円</w:t>
+            </w:r>
+          </w:p>
+        </w:tc>
+        <w:tc>
+          <w:tcPr/>
+          <w:p>
+            <w:pPr>
+              <w:pStyle w:val="Compact"/>
+              <w:jc w:val="right"/>
+            </w:pPr>
+            <w:r>
+              <w:t xml:space="preserve">約 4,000 円</w:t>
+            </w:r>
+          </w:p>
+        </w:tc>
+        <w:tc>
+          <w:tcPr/>
+          <w:p>
+            <w:pPr>
+              <w:pStyle w:val="Compact"/>
+              <w:jc w:val="right"/>
+            </w:pPr>
+            <w:r>
+              <w:rPr>
+                <w:bCs/>
+                <w:b/>
+              </w:rPr>
+              <w:t xml:space="preserve">約 5,000 円</w:t>
+            </w:r>
+          </w:p>
+        </w:tc>
+      </w:tr>
+      <w:tr>
+        <w:tc>
+          <w:tcPr/>
+          <w:p>
+            <w:pPr>
+              <w:pStyle w:val="Compact"/>
+              <w:jc w:val="left"/>
+            </w:pPr>
+            <w:r>
+              <w:t xml:space="preserve">本格運用</w:t>
+            </w:r>
+          </w:p>
+        </w:tc>
+        <w:tc>
+          <w:tcPr/>
+          <w:p>
+            <w:pPr>
+              <w:pStyle w:val="Compact"/>
+              <w:jc w:val="right"/>
+            </w:pPr>
+            <w:r>
+              <w:t xml:space="preserve">1,000</w:t>
+            </w:r>
+          </w:p>
+        </w:tc>
+        <w:tc>
+          <w:tcPr/>
+          <w:p>
+            <w:pPr>
+              <w:pStyle w:val="Compact"/>
+              <w:jc w:val="right"/>
+            </w:pPr>
+            <w:r>
+              <w:t xml:space="preserve">約 700 円</w:t>
+            </w:r>
+          </w:p>
+        </w:tc>
+        <w:tc>
+          <w:tcPr/>
+          <w:p>
+            <w:pPr>
+              <w:pStyle w:val="Compact"/>
+              <w:jc w:val="right"/>
+            </w:pPr>
+            <w:r>
+              <w:t xml:space="preserve">約 1,170 円</w:t>
+            </w:r>
+          </w:p>
+        </w:tc>
+        <w:tc>
+          <w:tcPr/>
+          <w:p>
+            <w:pPr>
+              <w:pStyle w:val="Compact"/>
+              <w:jc w:val="right"/>
+            </w:pPr>
+            <w:r>
+              <w:t xml:space="preserve">約 8,000 円</w:t>
+            </w:r>
+          </w:p>
+        </w:tc>
+        <w:tc>
+          <w:tcPr/>
+          <w:p>
+            <w:pPr>
+              <w:pStyle w:val="Compact"/>
+              <w:jc w:val="right"/>
+            </w:pPr>
+            <w:r>
+              <w:rPr>
+                <w:bCs/>
+                <w:b/>
+              </w:rPr>
+              <w:t xml:space="preserve">約 10,000 円</w:t>
+            </w:r>
+          </w:p>
+        </w:tc>
+      </w:tr>
+      <w:tr>
+        <w:tc>
+          <w:tcPr/>
+          <w:p>
+            <w:pPr>
+              <w:pStyle w:val="Compact"/>
+              <w:jc w:val="left"/>
+            </w:pPr>
+            <w:r>
+              <w:t xml:space="preserve">拡大運用</w:t>
+            </w:r>
+          </w:p>
+        </w:tc>
+        <w:tc>
+          <w:tcPr/>
+          <w:p>
+            <w:pPr>
+              <w:pStyle w:val="Compact"/>
+              <w:jc w:val="right"/>
+            </w:pPr>
+            <w:r>
+              <w:t xml:space="preserve">5,000</w:t>
+            </w:r>
+          </w:p>
+        </w:tc>
+        <w:tc>
+          <w:tcPr/>
+          <w:p>
+            <w:pPr>
+              <w:pStyle w:val="Compact"/>
+              <w:jc w:val="right"/>
+            </w:pPr>
+            <w:r>
+              <w:t xml:space="preserve">約 3,500 円</w:t>
+            </w:r>
+          </w:p>
+        </w:tc>
+        <w:tc>
+          <w:tcPr/>
+          <w:p>
+            <w:pPr>
+              <w:pStyle w:val="Compact"/>
+              <w:jc w:val="right"/>
+            </w:pPr>
+            <w:r>
+              <w:t xml:space="preserve">約 5,830 円</w:t>
+            </w:r>
+          </w:p>
+        </w:tc>
+        <w:tc>
+          <w:tcPr/>
+          <w:p>
+            <w:pPr>
+              <w:pStyle w:val="Compact"/>
+              <w:jc w:val="right"/>
+            </w:pPr>
+            <w:r>
+              <w:t xml:space="preserve">約 40,000 円</w:t>
+            </w:r>
+          </w:p>
+        </w:tc>
+        <w:tc>
+          <w:tcPr/>
+          <w:p>
+            <w:pPr>
+              <w:pStyle w:val="Compact"/>
+              <w:jc w:val="right"/>
+            </w:pPr>
+            <w:r>
+              <w:rPr>
+                <w:bCs/>
+                <w:b/>
+              </w:rPr>
+              <w:t xml:space="preserve">約 50,000 円</w:t>
+            </w:r>
+          </w:p>
+        </w:tc>
+      </w:tr>
+    </w:tbl>
+    <w:p>
+      <w:pPr>
+        <w:pStyle w:val="BlockText"/>
+      </w:pPr>
+      <w:r>
+        <w:rPr>
+          <w:bCs/>
+          <w:b/>
+        </w:rPr>
+        <w:t xml:space="preserve">💡 試算の前提</w:t>
+      </w:r>
+      <w:r>
+        <w:t xml:space="preserve">:</w:t>
+      </w:r>
+    </w:p>
+    <w:p>
+      <w:pPr>
+        <w:numPr>
+          <w:ilvl w:val="0"/>
+          <w:numId w:val="1017"/>
+        </w:numPr>
+        <w:pStyle w:val="Compact"/>
+      </w:pPr>
+      <w:r>
+        <w:t xml:space="preserve">1 ドル = 150 円</w:t>
+      </w:r>
+    </w:p>
+    <w:p>
+      <w:pPr>
+        <w:numPr>
+          <w:ilvl w:val="0"/>
+          <w:numId w:val="1017"/>
+        </w:numPr>
+        <w:pStyle w:val="Compact"/>
+      </w:pPr>
+      <w:r>
+        <w:t xml:space="preserve">アクティブユーザーの 100% が月 5 質問を AI ヘルスコーチで実施 (実態は 30〜50% 程度に留まる可能性大)</w:t>
+      </w:r>
+    </w:p>
+    <w:p>
+      <w:pPr>
+        <w:numPr>
+          <w:ilvl w:val="0"/>
+          <w:numId w:val="1017"/>
+        </w:numPr>
+        <w:pStyle w:val="Compact"/>
+      </w:pPr>
+      <w:r>
+        <w:t xml:space="preserve">AI 問診・AI スキャンは年 1 回想定で月按分</w:t>
+      </w:r>
+    </w:p>
+    <w:p>
+      <w:pPr>
+        <w:numPr>
+          <w:ilvl w:val="0"/>
+          <w:numId w:val="1017"/>
+        </w:numPr>
+        <w:pStyle w:val="Compact"/>
+      </w:pPr>
+      <w:r>
+        <w:t xml:space="preserve">ピーク日 (健康診断シーズン等) は月平均の 2〜3 倍に増える可能性あり</w:t>
+      </w:r>
+    </w:p>
+    <w:bookmarkEnd w:id="45"/>
+    <w:bookmarkStart w:id="46" w:name="Xb8f4f8e19f0041f6a24897b8b6c3b28514d91aa"/>
+    <w:p>
+      <w:pPr>
+        <w:pStyle w:val="Heading3"/>
+      </w:pPr>
+      <w:r>
+        <w:t xml:space="preserve">6.5 予算アラート 30,000 円 / 月の妥当性</w:t>
+      </w:r>
+    </w:p>
+    <w:p>
+      <w:pPr>
+        <w:pStyle w:val="FirstParagraph"/>
+      </w:pPr>
+      <w:r>
+        <w:t xml:space="preserve">§5 で推奨した予算アラート (30,000 円 / 月) は、</w:t>
+      </w:r>
+      <w:r>
+        <w:rPr>
+          <w:bCs/>
+          <w:b/>
+        </w:rPr>
+        <w:t xml:space="preserve">本格運用 (1,000 アクティブユーザー) の約 3 倍</w:t>
+      </w:r>
+      <w:r>
+        <w:t xml:space="preserve"> </w:t>
+      </w:r>
+      <w:r>
+        <w:t xml:space="preserve">に相当します。これにより:</w:t>
+      </w:r>
+    </w:p>
+    <w:p>
+      <w:pPr>
+        <w:numPr>
+          <w:ilvl w:val="0"/>
+          <w:numId w:val="1018"/>
+        </w:numPr>
+        <w:pStyle w:val="Compact"/>
+      </w:pPr>
+      <w:r>
+        <w:t xml:space="preserve">ピーク月 / 想定外の高負荷時にも余裕がある</w:t>
+      </w:r>
+    </w:p>
+    <w:p>
+      <w:pPr>
+        <w:numPr>
+          <w:ilvl w:val="0"/>
+          <w:numId w:val="1018"/>
+        </w:numPr>
+        <w:pStyle w:val="Compact"/>
+      </w:pPr>
+      <w:r>
+        <w:t xml:space="preserve">API キー漏洩等の異常利用 (短期で予算を食い潰すパターン) を早期検知可能</w:t>
+      </w:r>
+    </w:p>
+    <w:p>
+      <w:pPr>
+        <w:numPr>
+          <w:ilvl w:val="0"/>
+          <w:numId w:val="1018"/>
+        </w:numPr>
+        <w:pStyle w:val="Compact"/>
+      </w:pPr>
+      <w:r>
+        <w:t xml:space="preserve">必要に応じて 50% (15,000 円) や 90% (27,000 円) でも事前アラート受信</w:t>
+      </w:r>
+    </w:p>
+    <w:p>
+      <w:r>
+        <w:pict>
+          <v:rect style="width:0;height:1.5pt" o:hralign="center" o:hrstd="t" o:hr="t"/>
+        </w:pict>
+      </w:r>
+    </w:p>
+    <w:bookmarkEnd w:id="46"/>
+    <w:bookmarkEnd w:id="47"/>
+    <w:bookmarkStart w:id="48" w:name="Xae5701466ff4e858fd4537cc6a9a69b80e0c819"/>
+    <w:p>
+      <w:pPr>
+        <w:pStyle w:val="Heading2"/>
+      </w:pPr>
+      <w:r>
+        <w:t xml:space="preserve">7. トラブルシューティング</w:t>
       </w:r>
     </w:p>
     <w:tbl>
@@ -2115,31 +4404,31 @@
               <w:jc w:val="left"/>
             </w:pPr>
             <w:r>
-              <w:t xml:space="preserve">月間利用想定</w:t>
-            </w:r>
-          </w:p>
-        </w:tc>
-        <w:tc>
-          <w:tcPr/>
-          <w:p>
-            <w:pPr>
-              <w:pStyle w:val="Compact"/>
-              <w:jc w:val="right"/>
-            </w:pPr>
-            <w:r>
-              <w:t xml:space="preserve">API コール数</w:t>
-            </w:r>
-          </w:p>
-        </w:tc>
-        <w:tc>
-          <w:tcPr/>
-          <w:p>
-            <w:pPr>
-              <w:pStyle w:val="Compact"/>
-              <w:jc w:val="right"/>
-            </w:pPr>
-            <w:r>
-              <w:t xml:space="preserve">推定費用 (税抜)</w:t>
+              <w:t xml:space="preserve">症状</w:t>
+            </w:r>
+          </w:p>
+        </w:tc>
+        <w:tc>
+          <w:tcPr/>
+          <w:p>
+            <w:pPr>
+              <w:pStyle w:val="Compact"/>
+              <w:jc w:val="left"/>
+            </w:pPr>
+            <w:r>
+              <w:t xml:space="preserve">原因</w:t>
+            </w:r>
+          </w:p>
+        </w:tc>
+        <w:tc>
+          <w:tcPr/>
+          <w:p>
+            <w:pPr>
+              <w:pStyle w:val="Compact"/>
+              <w:jc w:val="left"/>
+            </w:pPr>
+            <w:r>
+              <w:t xml:space="preserve">対処</w:t>
             </w:r>
           </w:p>
         </w:tc>
@@ -2153,31 +4442,31 @@
               <w:jc w:val="left"/>
             </w:pPr>
             <w:r>
-              <w:t xml:space="preserve">パイロット期 (〜100 ユーザー)</w:t>
-            </w:r>
-          </w:p>
-        </w:tc>
-        <w:tc>
-          <w:tcPr/>
-          <w:p>
-            <w:pPr>
-              <w:pStyle w:val="Compact"/>
-              <w:jc w:val="right"/>
-            </w:pPr>
-            <w:r>
-              <w:t xml:space="preserve">〜5,000 回</w:t>
-            </w:r>
-          </w:p>
-        </w:tc>
-        <w:tc>
-          <w:tcPr/>
-          <w:p>
-            <w:pPr>
-              <w:pStyle w:val="Compact"/>
-              <w:jc w:val="right"/>
-            </w:pPr>
-            <w:r>
-              <w:t xml:space="preserve">〜3,000 円</w:t>
+              <w:t xml:space="preserve">「API key not valid」エラー</w:t>
+            </w:r>
+          </w:p>
+        </w:tc>
+        <w:tc>
+          <w:tcPr/>
+          <w:p>
+            <w:pPr>
+              <w:pStyle w:val="Compact"/>
+              <w:jc w:val="left"/>
+            </w:pPr>
+            <w:r>
+              <w:t xml:space="preserve">API キーが間違っている / Generative Language API が無効</w:t>
+            </w:r>
+          </w:p>
+        </w:tc>
+        <w:tc>
+          <w:tcPr/>
+          <w:p>
+            <w:pPr>
+              <w:pStyle w:val="Compact"/>
+              <w:jc w:val="left"/>
+            </w:pPr>
+            <w:r>
+              <w:t xml:space="preserve">手順 1 で API を有効化、手順 2 でキーを再発行</w:t>
             </w:r>
           </w:p>
         </w:tc>
@@ -2191,31 +4480,31 @@
               <w:jc w:val="left"/>
             </w:pPr>
             <w:r>
-              <w:t xml:space="preserve">初期運用 (〜500 ユーザー)</w:t>
-            </w:r>
-          </w:p>
-        </w:tc>
-        <w:tc>
-          <w:tcPr/>
-          <w:p>
-            <w:pPr>
-              <w:pStyle w:val="Compact"/>
-              <w:jc w:val="right"/>
-            </w:pPr>
-            <w:r>
-              <w:t xml:space="preserve">〜25,000 回</w:t>
-            </w:r>
-          </w:p>
-        </w:tc>
-        <w:tc>
-          <w:tcPr/>
-          <w:p>
-            <w:pPr>
-              <w:pStyle w:val="Compact"/>
-              <w:jc w:val="right"/>
-            </w:pPr>
-            <w:r>
-              <w:t xml:space="preserve">〜15,000 円</w:t>
+              <w:t xml:space="preserve">「Quota exceeded」エラー</w:t>
+            </w:r>
+          </w:p>
+        </w:tc>
+        <w:tc>
+          <w:tcPr/>
+          <w:p>
+            <w:pPr>
+              <w:pStyle w:val="Compact"/>
+              <w:jc w:val="left"/>
+            </w:pPr>
+            <w:r>
+              <w:t xml:space="preserve">無料枠を超えたが請求アカウント未紐付け</w:t>
+            </w:r>
+          </w:p>
+        </w:tc>
+        <w:tc>
+          <w:tcPr/>
+          <w:p>
+            <w:pPr>
+              <w:pStyle w:val="Compact"/>
+              <w:jc w:val="left"/>
+            </w:pPr>
+            <w:r>
+              <w:t xml:space="preserve">請求アカウントの紐付けを再確認 (本書冒頭の前提)</w:t>
             </w:r>
           </w:p>
         </w:tc>
@@ -2229,44 +4518,112 @@
               <w:jc w:val="left"/>
             </w:pPr>
             <w:r>
-              <w:t xml:space="preserve">本格運用 (〜1,000 ユーザー)</w:t>
-            </w:r>
-          </w:p>
-        </w:tc>
-        <w:tc>
-          <w:tcPr/>
-          <w:p>
-            <w:pPr>
-              <w:pStyle w:val="Compact"/>
-              <w:jc w:val="right"/>
-            </w:pPr>
-            <w:r>
-              <w:t xml:space="preserve">〜50,000 回</w:t>
-            </w:r>
-          </w:p>
-        </w:tc>
-        <w:tc>
-          <w:tcPr/>
-          <w:p>
-            <w:pPr>
-              <w:pStyle w:val="Compact"/>
-              <w:jc w:val="right"/>
-            </w:pPr>
-            <w:r>
-              <w:t xml:space="preserve">〜30,000 円</w:t>
+              <w:t xml:space="preserve">「Permission denied」</w:t>
+            </w:r>
+          </w:p>
+        </w:tc>
+        <w:tc>
+          <w:tcPr/>
+          <w:p>
+            <w:pPr>
+              <w:pStyle w:val="Compact"/>
+              <w:jc w:val="left"/>
+            </w:pPr>
+            <w:r>
+              <w:t xml:space="preserve">アカウントに Cloud 管理権限が無い</w:t>
+            </w:r>
+          </w:p>
+        </w:tc>
+        <w:tc>
+          <w:tcPr/>
+          <w:p>
+            <w:pPr>
+              <w:pStyle w:val="Compact"/>
+              <w:jc w:val="left"/>
+            </w:pPr>
+            <w:r>
+              <w:t xml:space="preserve">Workspace 管理者に「Project Owner / Billing Administrator」権限の付与を依頼</w:t>
+            </w:r>
+          </w:p>
+        </w:tc>
+      </w:tr>
+      <w:tr>
+        <w:tc>
+          <w:tcPr/>
+          <w:p>
+            <w:pPr>
+              <w:pStyle w:val="Compact"/>
+              <w:jc w:val="left"/>
+            </w:pPr>
+            <w:r>
+              <w:t xml:space="preserve">想定外の高額請求</w:t>
+            </w:r>
+          </w:p>
+        </w:tc>
+        <w:tc>
+          <w:tcPr/>
+          <w:p>
+            <w:pPr>
+              <w:pStyle w:val="Compact"/>
+              <w:jc w:val="left"/>
+            </w:pPr>
+            <w:r>
+              <w:t xml:space="preserve">API キー漏洩の可能性</w:t>
+            </w:r>
+          </w:p>
+        </w:tc>
+        <w:tc>
+          <w:tcPr/>
+          <w:p>
+            <w:pPr>
+              <w:pStyle w:val="Compact"/>
+              <w:jc w:val="left"/>
+            </w:pPr>
+            <w:r>
+              <w:t xml:space="preserve">即座にキーを削除・再発行 (手順 2)、Cloud Logging で異常アクセスを確認、Wellfort 情報セキュリティ責任者に報告</w:t>
+            </w:r>
+          </w:p>
+        </w:tc>
+      </w:tr>
+      <w:tr>
+        <w:tc>
+          <w:tcPr/>
+          <w:p>
+            <w:pPr>
+              <w:pStyle w:val="Compact"/>
+              <w:jc w:val="left"/>
+            </w:pPr>
+            <w:r>
+              <w:t xml:space="preserve">プロジェクトセレクタに対象プロジェクトが出ない</w:t>
+            </w:r>
+          </w:p>
+        </w:tc>
+        <w:tc>
+          <w:tcPr/>
+          <w:p>
+            <w:pPr>
+              <w:pStyle w:val="Compact"/>
+              <w:jc w:val="left"/>
+            </w:pPr>
+            <w:r>
+              <w:t xml:space="preserve">アカウントが間違っている (個人アカウントでログイン中)</w:t>
+            </w:r>
+          </w:p>
+        </w:tc>
+        <w:tc>
+          <w:tcPr/>
+          <w:p>
+            <w:pPr>
+              <w:pStyle w:val="Compact"/>
+              <w:jc w:val="left"/>
+            </w:pPr>
+            <w:r>
+              <w:t xml:space="preserve">画面右上のプロフィールアイコンから法人アカウントに切替え</w:t>
             </w:r>
           </w:p>
         </w:tc>
       </w:tr>
     </w:tbl>
-    <w:p>
-      <w:pPr>
-        <w:pStyle w:val="BodyText"/>
-      </w:pPr>
-      <w:r>
-        <w:t xml:space="preserve">※ 料金は Gemini 2.5 Flash の入力 $0.075 / 1M トークン、出力 $0.30 / 1M トークン (2026 年 6 月時点) を基に試算。為替・料金改定で変動します。</w:t>
-      </w:r>
-    </w:p>
     <w:p>
       <w:r>
         <w:pict>
@@ -2274,270 +4631,8 @@
         </w:pict>
       </w:r>
     </w:p>
-    <w:bookmarkEnd w:id="36"/>
-    <w:bookmarkEnd w:id="37"/>
-    <w:bookmarkStart w:id="38" w:name="Xae5701466ff4e858fd4537cc6a9a69b80e0c819"/>
-    <w:p>
-      <w:pPr>
-        <w:pStyle w:val="Heading2"/>
-      </w:pPr>
-      <w:r>
-        <w:t xml:space="preserve">7. トラブルシューティング</w:t>
-      </w:r>
-    </w:p>
-    <w:tbl>
-      <w:tblPr>
-        <w:tblStyle w:val="Table"/>
-        <w:tblW w:type="auto" w:w="0"/>
-        <w:tblLook w:firstRow="1" w:lastRow="0" w:firstColumn="0" w:lastColumn="0" w:noHBand="0" w:noVBand="0" w:val="0020"/>
-        <w:jc w:val="start"/>
-      </w:tblPr>
-      <w:tblGrid>
-        <w:gridCol w:w="2640"/>
-        <w:gridCol w:w="2640"/>
-        <w:gridCol w:w="2640"/>
-      </w:tblGrid>
-      <w:tr>
-        <w:trPr>
-          <w:tblHeader w:val="true"/>
-        </w:trPr>
-        <w:tc>
-          <w:tcPr/>
-          <w:p>
-            <w:pPr>
-              <w:pStyle w:val="Compact"/>
-              <w:jc w:val="left"/>
-            </w:pPr>
-            <w:r>
-              <w:t xml:space="preserve">症状</w:t>
-            </w:r>
-          </w:p>
-        </w:tc>
-        <w:tc>
-          <w:tcPr/>
-          <w:p>
-            <w:pPr>
-              <w:pStyle w:val="Compact"/>
-              <w:jc w:val="left"/>
-            </w:pPr>
-            <w:r>
-              <w:t xml:space="preserve">原因</w:t>
-            </w:r>
-          </w:p>
-        </w:tc>
-        <w:tc>
-          <w:tcPr/>
-          <w:p>
-            <w:pPr>
-              <w:pStyle w:val="Compact"/>
-              <w:jc w:val="left"/>
-            </w:pPr>
-            <w:r>
-              <w:t xml:space="preserve">対処</w:t>
-            </w:r>
-          </w:p>
-        </w:tc>
-      </w:tr>
-      <w:tr>
-        <w:tc>
-          <w:tcPr/>
-          <w:p>
-            <w:pPr>
-              <w:pStyle w:val="Compact"/>
-              <w:jc w:val="left"/>
-            </w:pPr>
-            <w:r>
-              <w:t xml:space="preserve">「API key not valid」エラー</w:t>
-            </w:r>
-          </w:p>
-        </w:tc>
-        <w:tc>
-          <w:tcPr/>
-          <w:p>
-            <w:pPr>
-              <w:pStyle w:val="Compact"/>
-              <w:jc w:val="left"/>
-            </w:pPr>
-            <w:r>
-              <w:t xml:space="preserve">API キーが間違っている / Generative Language API が無効</w:t>
-            </w:r>
-          </w:p>
-        </w:tc>
-        <w:tc>
-          <w:tcPr/>
-          <w:p>
-            <w:pPr>
-              <w:pStyle w:val="Compact"/>
-              <w:jc w:val="left"/>
-            </w:pPr>
-            <w:r>
-              <w:t xml:space="preserve">手順 1 で API を有効化、手順 2 でキーを再発行</w:t>
-            </w:r>
-          </w:p>
-        </w:tc>
-      </w:tr>
-      <w:tr>
-        <w:tc>
-          <w:tcPr/>
-          <w:p>
-            <w:pPr>
-              <w:pStyle w:val="Compact"/>
-              <w:jc w:val="left"/>
-            </w:pPr>
-            <w:r>
-              <w:t xml:space="preserve">「Quota exceeded」エラー</w:t>
-            </w:r>
-          </w:p>
-        </w:tc>
-        <w:tc>
-          <w:tcPr/>
-          <w:p>
-            <w:pPr>
-              <w:pStyle w:val="Compact"/>
-              <w:jc w:val="left"/>
-            </w:pPr>
-            <w:r>
-              <w:t xml:space="preserve">無料枠を超えたが請求アカウント未紐付け</w:t>
-            </w:r>
-          </w:p>
-        </w:tc>
-        <w:tc>
-          <w:tcPr/>
-          <w:p>
-            <w:pPr>
-              <w:pStyle w:val="Compact"/>
-              <w:jc w:val="left"/>
-            </w:pPr>
-            <w:r>
-              <w:t xml:space="preserve">請求アカウントの紐付けを再確認 (本書冒頭の前提)</w:t>
-            </w:r>
-          </w:p>
-        </w:tc>
-      </w:tr>
-      <w:tr>
-        <w:tc>
-          <w:tcPr/>
-          <w:p>
-            <w:pPr>
-              <w:pStyle w:val="Compact"/>
-              <w:jc w:val="left"/>
-            </w:pPr>
-            <w:r>
-              <w:t xml:space="preserve">「Permission denied」</w:t>
-            </w:r>
-          </w:p>
-        </w:tc>
-        <w:tc>
-          <w:tcPr/>
-          <w:p>
-            <w:pPr>
-              <w:pStyle w:val="Compact"/>
-              <w:jc w:val="left"/>
-            </w:pPr>
-            <w:r>
-              <w:t xml:space="preserve">アカウントに Cloud 管理権限が無い</w:t>
-            </w:r>
-          </w:p>
-        </w:tc>
-        <w:tc>
-          <w:tcPr/>
-          <w:p>
-            <w:pPr>
-              <w:pStyle w:val="Compact"/>
-              <w:jc w:val="left"/>
-            </w:pPr>
-            <w:r>
-              <w:t xml:space="preserve">Workspace 管理者に「Project Owner / Billing Administrator」権限の付与を依頼</w:t>
-            </w:r>
-          </w:p>
-        </w:tc>
-      </w:tr>
-      <w:tr>
-        <w:tc>
-          <w:tcPr/>
-          <w:p>
-            <w:pPr>
-              <w:pStyle w:val="Compact"/>
-              <w:jc w:val="left"/>
-            </w:pPr>
-            <w:r>
-              <w:t xml:space="preserve">想定外の高額請求</w:t>
-            </w:r>
-          </w:p>
-        </w:tc>
-        <w:tc>
-          <w:tcPr/>
-          <w:p>
-            <w:pPr>
-              <w:pStyle w:val="Compact"/>
-              <w:jc w:val="left"/>
-            </w:pPr>
-            <w:r>
-              <w:t xml:space="preserve">API キー漏洩の可能性</w:t>
-            </w:r>
-          </w:p>
-        </w:tc>
-        <w:tc>
-          <w:tcPr/>
-          <w:p>
-            <w:pPr>
-              <w:pStyle w:val="Compact"/>
-              <w:jc w:val="left"/>
-            </w:pPr>
-            <w:r>
-              <w:t xml:space="preserve">即座にキーを削除・再発行 (手順 2)、Cloud Logging で異常アクセスを確認、Wellfort 情報セキュリティ責任者に報告</w:t>
-            </w:r>
-          </w:p>
-        </w:tc>
-      </w:tr>
-      <w:tr>
-        <w:tc>
-          <w:tcPr/>
-          <w:p>
-            <w:pPr>
-              <w:pStyle w:val="Compact"/>
-              <w:jc w:val="left"/>
-            </w:pPr>
-            <w:r>
-              <w:t xml:space="preserve">プロジェクトセレクタに対象プロジェクトが出ない</w:t>
-            </w:r>
-          </w:p>
-        </w:tc>
-        <w:tc>
-          <w:tcPr/>
-          <w:p>
-            <w:pPr>
-              <w:pStyle w:val="Compact"/>
-              <w:jc w:val="left"/>
-            </w:pPr>
-            <w:r>
-              <w:t xml:space="preserve">アカウントが間違っている (個人アカウントでログイン中)</w:t>
-            </w:r>
-          </w:p>
-        </w:tc>
-        <w:tc>
-          <w:tcPr/>
-          <w:p>
-            <w:pPr>
-              <w:pStyle w:val="Compact"/>
-              <w:jc w:val="left"/>
-            </w:pPr>
-            <w:r>
-              <w:t xml:space="preserve">画面右上のプロフィールアイコンから法人アカウントに切替え</w:t>
-            </w:r>
-          </w:p>
-        </w:tc>
-      </w:tr>
-    </w:tbl>
-    <w:p>
-      <w:r>
-        <w:pict>
-          <v:rect style="width:0;height:1.5pt" o:hralign="center" o:hrstd="t" o:hr="t"/>
-        </w:pict>
-      </w:r>
-    </w:p>
-    <w:bookmarkEnd w:id="38"/>
-    <w:bookmarkStart w:id="39" w:name="Xf07f2c82a3f281f927752d56ecd2368605e9c0d"/>
+    <w:bookmarkEnd w:id="48"/>
+    <w:bookmarkStart w:id="49" w:name="Xf07f2c82a3f281f927752d56ecd2368605e9c0d"/>
     <w:p>
       <w:pPr>
         <w:pStyle w:val="Heading2"/>
@@ -2737,8 +4832,8 @@
         </w:pict>
       </w:r>
     </w:p>
-    <w:bookmarkEnd w:id="39"/>
-    <w:bookmarkStart w:id="40" w:name="X7a2e70229e445aded1a281ad955da74611d6563"/>
+    <w:bookmarkEnd w:id="49"/>
+    <w:bookmarkStart w:id="50" w:name="X7a2e70229e445aded1a281ad955da74611d6563"/>
     <w:p>
       <w:pPr>
         <w:pStyle w:val="Heading2"/>
@@ -2874,8 +4969,8 @@
         <w:t xml:space="preserve">以上</w:t>
       </w:r>
     </w:p>
-    <w:bookmarkEnd w:id="40"/>
-    <w:bookmarkEnd w:id="41"/>
+    <w:bookmarkEnd w:id="50"/>
+    <w:bookmarkEnd w:id="51"/>
     <w:sectPr/>
   </w:body>
 </w:document>
@@ -3150,34 +5245,7 @@
     <w:abstractNumId w:val="991"/>
   </w:num>
   <w:num w:numId="1002">
-    <w:abstractNumId w:val="99411"/>
-    <w:lvlOverride w:ilvl="0">
-      <w:startOverride w:val="1"/>
-    </w:lvlOverride>
-    <w:lvlOverride w:ilvl="1">
-      <w:startOverride w:val="1"/>
-    </w:lvlOverride>
-    <w:lvlOverride w:ilvl="2">
-      <w:startOverride w:val="1"/>
-    </w:lvlOverride>
-    <w:lvlOverride w:ilvl="3">
-      <w:startOverride w:val="1"/>
-    </w:lvlOverride>
-    <w:lvlOverride w:ilvl="4">
-      <w:startOverride w:val="1"/>
-    </w:lvlOverride>
-    <w:lvlOverride w:ilvl="5">
-      <w:startOverride w:val="1"/>
-    </w:lvlOverride>
-    <w:lvlOverride w:ilvl="6">
-      <w:startOverride w:val="1"/>
-    </w:lvlOverride>
-    <w:lvlOverride w:ilvl="7">
-      <w:startOverride w:val="1"/>
-    </w:lvlOverride>
-    <w:lvlOverride w:ilvl="8">
-      <w:startOverride w:val="1"/>
-    </w:lvlOverride>
+    <w:abstractNumId w:val="991"/>
   </w:num>
   <w:num w:numId="1003">
     <w:abstractNumId w:val="991"/>
@@ -3249,15 +5317,6 @@
     <w:abstractNumId w:val="991"/>
   </w:num>
   <w:num w:numId="1008">
-    <w:abstractNumId w:val="991"/>
-  </w:num>
-  <w:num w:numId="1009">
-    <w:abstractNumId w:val="991"/>
-  </w:num>
-  <w:num w:numId="1010">
-    <w:abstractNumId w:val="991"/>
-  </w:num>
-  <w:num w:numId="1011">
     <w:abstractNumId w:val="99411"/>
     <w:lvlOverride w:ilvl="0">
       <w:startOverride w:val="1"/>
@@ -3287,7 +5346,19 @@
       <w:startOverride w:val="1"/>
     </w:lvlOverride>
   </w:num>
+  <w:num w:numId="1009">
+    <w:abstractNumId w:val="991"/>
+  </w:num>
+  <w:num w:numId="1010">
+    <w:abstractNumId w:val="991"/>
+  </w:num>
+  <w:num w:numId="1011">
+    <w:abstractNumId w:val="991"/>
+  </w:num>
   <w:num w:numId="1012">
+    <w:abstractNumId w:val="991"/>
+  </w:num>
+  <w:num w:numId="1013">
     <w:abstractNumId w:val="99411"/>
     <w:lvlOverride w:ilvl="0">
       <w:startOverride w:val="1"/>
@@ -3317,10 +5388,46 @@
       <w:startOverride w:val="1"/>
     </w:lvlOverride>
   </w:num>
-  <w:num w:numId="1013">
+  <w:num w:numId="1014">
+    <w:abstractNumId w:val="99411"/>
+    <w:lvlOverride w:ilvl="0">
+      <w:startOverride w:val="1"/>
+    </w:lvlOverride>
+    <w:lvlOverride w:ilvl="1">
+      <w:startOverride w:val="1"/>
+    </w:lvlOverride>
+    <w:lvlOverride w:ilvl="2">
+      <w:startOverride w:val="1"/>
+    </w:lvlOverride>
+    <w:lvlOverride w:ilvl="3">
+      <w:startOverride w:val="1"/>
+    </w:lvlOverride>
+    <w:lvlOverride w:ilvl="4">
+      <w:startOverride w:val="1"/>
+    </w:lvlOverride>
+    <w:lvlOverride w:ilvl="5">
+      <w:startOverride w:val="1"/>
+    </w:lvlOverride>
+    <w:lvlOverride w:ilvl="6">
+      <w:startOverride w:val="1"/>
+    </w:lvlOverride>
+    <w:lvlOverride w:ilvl="7">
+      <w:startOverride w:val="1"/>
+    </w:lvlOverride>
+    <w:lvlOverride w:ilvl="8">
+      <w:startOverride w:val="1"/>
+    </w:lvlOverride>
+  </w:num>
+  <w:num w:numId="1015">
     <w:abstractNumId w:val="991"/>
   </w:num>
-  <w:num w:numId="1014">
+  <w:num w:numId="1016">
+    <w:abstractNumId w:val="991"/>
+  </w:num>
+  <w:num w:numId="1017">
+    <w:abstractNumId w:val="991"/>
+  </w:num>
+  <w:num w:numId="1018">
     <w:abstractNumId w:val="991"/>
   </w:num>
 </w:numbering>

</xml_diff>